<commit_message>
Update employment agreement documents
</commit_message>
<xml_diff>
--- a/templates/employee-contract-template.docx
+++ b/templates/employee-contract-template.docx
@@ -163,10 +163,8 @@
       <w:r>
         <w:rPr>
           <w:b/>
-          <w:bCs/>
-          <w:highlight w:val="yellow"/>
-        </w:rPr>
-        <w:t>“JOINING DATE”</w:t>
+        </w:rPr>
+        <w:t>JOINING DATE</w:t>
       </w:r>
       <w:r>
         <w:t xml:space="preserve">, by and between Bohemian Curations Private Limited, a company incorporated under the Companies Act, 2013, having its registered office at </w:t>
@@ -179,222 +177,226 @@
       </w:r>
       <w:r>
         <w:t xml:space="preserve">and </w:t>
+      </w:r>
+      <w:r>
+        <w:rPr>
+          <w:b/>
+        </w:rPr>
+        <w:t>EMPLOYEE NAME</w:t>
+      </w:r>
+      <w:r>
+        <w:t xml:space="preserve">, residing at </w:t>
+      </w:r>
+      <w:proofErr w:type="spellStart"/>
+      <w:r>
+        <w:rPr>
+          <w:b/>
+        </w:rPr>
+        <w:t>ADDRESS</w:t>
+      </w:r>
+      <w:proofErr w:type="spellEnd"/>
+      <w:r>
+        <w:rPr>
+          <w:b/>
+        </w:rPr>
+      </w:r>
+      <w:proofErr w:type="spellStart"/>
+      <w:r>
+        <w:rPr>
+          <w:b/>
+        </w:rPr>
+      </w:r>
+      <w:proofErr w:type="spellEnd"/>
+      <w:r>
+        <w:rPr>
+          <w:b/>
+        </w:rPr>
+      </w:r>
+      <w:proofErr w:type="spellStart"/>
+      <w:r>
+        <w:rPr>
+          <w:b/>
+        </w:rPr>
+      </w:r>
+      <w:proofErr w:type="spellEnd"/>
+      <w:r>
+        <w:rPr>
+          <w:b/>
+        </w:rPr>
+      </w:r>
+      <w:r>
+        <w:rPr>
+          <w:b/>
+        </w:rPr>
+      </w:r>
+      <w:proofErr w:type="spellStart"/>
+      <w:r>
+        <w:rPr>
+          <w:b/>
+        </w:rPr>
+      </w:r>
+      <w:proofErr w:type="spellEnd"/>
+      <w:r>
+        <w:rPr>
+          <w:b/>
+        </w:rPr>
+      </w:r>
+      <w:r>
+        <w:t xml:space="preserve"> </w:t>
+      </w:r>
+      <w:r>
+        <w:t>(hereinafter referred to as the “Employee”, which expression shall, unless repugnant to the context or meaning thereof, include his heirs, legal representatives, administrators, executors, and permitted assigns).</w:t>
+      </w:r>
+      <w:r>
+        <w:br/>
+      </w:r>
+      <w:r>
+        <w:br/>
+        <w:t>1. For the purposes of this Agreement: (a) “Confidential Information” means all non-public, proprietary, or commercially valuable information, whether oral, written, electronic, or otherwise embodied, including but not limited to: (</w:t>
+      </w:r>
+      <w:proofErr w:type="spellStart"/>
+      <w:r>
+        <w:t>i</w:t>
+      </w:r>
+      <w:proofErr w:type="spellEnd"/>
+      <w:r>
+        <w:t>) source code, object code, algorithms, and software; (ii) business plans, marketing strategies, pricing models, and client or vendor lists; (iii) trade secrets; (iv) contractual terms with third parties; and (v) any other information designated as confidential by the Company; (b) “Work Product” means all works, code, designs, inventions, trade secrets, algorithms, processes, writings, ideas, documentation, data, and materials, whether patentable or not, created, conceived, authored, developed, or contributed to by the Employee, alone or jointly, during the term of employment, that relate to the business of the Company or its anticipated business; (c) “Termination” means cessation of the employment relationship under any mode or circumstance, whether initiated by the Company or the Employee. Words importing the singular include the plural and vice versa; headings are for convenience only and shall not affect interpretation.</w:t>
+      </w:r>
+      <w:r>
+        <w:br/>
+      </w:r>
+      <w:r>
+        <w:br/>
+        <w:t xml:space="preserve">2. The Employee is hereby appointed to the position of </w:t>
+      </w:r>
+      <w:r>
+        <w:rPr>
+          <w:b/>
+        </w:rPr>
+        <w:t>DESIGNATION</w:t>
+      </w:r>
+      <w:r>
+        <w:t xml:space="preserve"> </w:t>
+      </w:r>
+      <w:r>
+        <w:t xml:space="preserve">reporting to such </w:t>
+      </w:r>
+      <w:bookmarkStart w:id="3" w:name="_Hlk223777637"/>
+      <w:r>
+        <w:t xml:space="preserve">superior(s) </w:t>
+      </w:r>
+      <w:bookmarkEnd w:id="3"/>
+      <w:r>
+        <w:t>as the Company may designate from time to time, with effect from</w:t>
       </w:r>
       <w:r>
         <w:rPr>
           <w:b/>
           <w:bCs/>
-          <w:highlight w:val="yellow"/>
-        </w:rPr>
-        <w:t>“Mr./Ms. NAME”</w:t>
-      </w:r>
-      <w:r>
-        <w:t xml:space="preserve">, residing at </w:t>
+        </w:rPr>
+        <w:t xml:space="preserve"> </w:t>
+      </w:r>
+      <w:r>
+        <w:rPr>
+          <w:b/>
+        </w:rPr>
+        <w:t>JOINING DATE</w:t>
+      </w:r>
+      <w:r>
+        <w:t xml:space="preserve"> </w:t>
+      </w:r>
+      <w:r>
+        <w:t>(“Commencement Date”). The Employee acknowledges that his appointment is conditional upon satisfactory completion of all pre-employment requirements, including verification of credentials.</w:t>
+      </w:r>
+    </w:p>
+    <w:p>
+      <w:r>
+        <w:rPr>
+          <w:rFonts w:asciiTheme="majorHAnsi" w:hAnsiTheme="majorHAnsi" w:cstheme="majorHAnsi"/>
+        </w:rPr>
+        <w:t xml:space="preserve">The Employee undertakes to furnish full, complete, and accurate information regarding his personal details, qualifications, and previous employment, if any. If any declaration, statement, or information provided by the Employee is found to be false, misleading, incomplete, or if any material fact is </w:t>
+      </w:r>
+      <w:r>
+        <w:rPr>
+          <w:rFonts w:asciiTheme="majorHAnsi" w:hAnsiTheme="majorHAnsi" w:cstheme="majorHAnsi"/>
+        </w:rPr>
+        <w:t>willfully</w:t>
+      </w:r>
+      <w:r>
+        <w:rPr>
+          <w:rFonts w:asciiTheme="majorHAnsi" w:hAnsiTheme="majorHAnsi" w:cstheme="majorHAnsi"/>
+        </w:rPr>
+        <w:t xml:space="preserve"> suppressed, the Company shall be entitled to terminate the Employee’s services forthwith, without any notice or compensation, and without prejudice to any legal or equitable remedies available to the Company.</w:t>
+      </w:r>
+      <w:r>
+        <w:br/>
+      </w:r>
+      <w:r>
+        <w:br/>
+      </w:r>
+      <w:r>
+        <w:lastRenderedPageBreak/>
+        <w:br/>
+        <w:t xml:space="preserve">3. The Employee shall be on probation for a period of three (3) months from the Commencement Date, which may be extended at the Company’s sole discretion by up to an additional three (3) months. During the probation period (including any extension), the </w:t>
+      </w:r>
+      <w:r>
+        <w:t>Employee’s performance, conduct, and suitability for the role shall be under continuous review, and his</w:t>
+      </w:r>
+      <w:r>
+        <w:t xml:space="preserve"> </w:t>
+      </w:r>
+      <w:r>
+        <w:t>employment may be terminated by the Company at any time, without assigning any reason, by providing seven (7) days’ prior written notice or salary in lieu thereof. The Employee may terminate his employment during the probationary period only upon providing thirty (30) days’ prior written notice to the Company, or, at the Company’s discretion, by paying to the Company an amount equivalent to the gross salary for the unserved portion of such notice period.</w:t>
+      </w:r>
+      <w:r>
+        <w:br/>
+      </w:r>
+      <w:r>
+        <w:br/>
+        <w:t xml:space="preserve">4. The Employee shall primarily work from the Company’s </w:t>
+      </w:r>
+      <w:proofErr w:type="spellStart"/>
+      <w:r>
+        <w:t>ZenZebra</w:t>
+      </w:r>
+      <w:proofErr w:type="spellEnd"/>
+      <w:r>
+        <w:t xml:space="preserve"> HQ, New Delhi. Notwithstanding the foregoing, the Employee acknowledges and agrees that the Company may, at its sole discretion, require him to work from any other location or remotely. Normal working days shall be Monday to Saturday; working hours shall be as prescribed by the Company and may be altered from time to time without additional compensation, subject to applicable law.</w:t>
+      </w:r>
+      <w:r>
+        <w:br/>
+      </w:r>
+      <w:r>
+        <w:br/>
+        <w:t xml:space="preserve">5. The Employee shall receive a monthly </w:t>
+      </w:r>
+      <w:r>
+        <w:t>CTC</w:t>
+      </w:r>
+      <w:r>
+        <w:t xml:space="preserve"> of </w:t>
       </w:r>
       <w:r>
         <w:rPr>
           <w:b/>
           <w:bCs/>
-          <w:highlight w:val="yellow"/>
-        </w:rPr>
-        <w:t>“ADDRESS”</w:t>
-      </w:r>
-      <w:r>
-        <w:t xml:space="preserve"> </w:t>
-      </w:r>
-      <w:r>
-        <w:t>(hereinafter referred to as the “Employee”, which expression shall, unless repugnant to the context or meaning thereof, include h</w:t>
-      </w:r>
-      <w:r>
-        <w:t>is</w:t>
-      </w:r>
-      <w:r>
-        <w:t xml:space="preserve"> heirs, legal representatives, administrators, executors, and permitted assigns).</w:t>
-      </w:r>
-      <w:r>
-        <w:br/>
-      </w:r>
-      <w:r>
-        <w:br/>
-        <w:t>1. For the purposes of this Agreement: (a) “Confidential Information” means all non-public, proprietary, or commercially valuable information, whether oral, written, electronic, or otherwise embodied, including but not limited to: (</w:t>
-      </w:r>
-      <w:proofErr w:type="spellStart"/>
-      <w:r>
-        <w:t>i</w:t>
-      </w:r>
-      <w:proofErr w:type="spellEnd"/>
-      <w:r>
-        <w:t>) source code, object code, algorithms, and software; (ii) business plans, marketing strategies, pricing models, and client or vendor lists; (iii) trade secrets; (iv) contractual terms with third parties; and (v) any other information designated as confidential by the Company; (b) “Work Product” means all works, code, designs, inventions, trade secrets, algorithms, processes, writings, ideas, documentation, data, and materials, whether patentable or not, created, conceived, authored, developed, or contributed to by the Employee, alone or jointly, during the term of employment, that relate to the business of the Company or its anticipated business; (c) “Termination” means cessation of the employment relationship under any mode or circumstance, whether initiated by the Company or the Employee. Words importing the singular include the plural and vice versa; headings are for convenience only and shall not affect interpretation.</w:t>
-      </w:r>
-      <w:r>
-        <w:br/>
-      </w:r>
-      <w:r>
-        <w:br/>
-        <w:t xml:space="preserve">2. The Employee is hereby appointed to the position of </w:t>
+        </w:rPr>
+        <w:t xml:space="preserve">INR </w:t>
       </w:r>
       <w:r>
         <w:rPr>
           <w:b/>
-          <w:bCs/>
-          <w:highlight w:val="yellow"/>
-        </w:rPr>
-        <w:t>“DESIGNATION”</w:t>
-      </w:r>
-      <w:r>
-        <w:t xml:space="preserve"> </w:t>
-      </w:r>
-      <w:r>
-        <w:t xml:space="preserve">reporting to such </w:t>
-      </w:r>
-      <w:bookmarkStart w:id="3" w:name="_Hlk223777637"/>
-      <w:r>
-        <w:t xml:space="preserve">superior(s) </w:t>
-      </w:r>
-      <w:bookmarkEnd w:id="3"/>
-      <w:r>
-        <w:t>as the Company may designate from time to time, with effect from</w:t>
+        </w:rPr>
+        <w:t>₹54,167</w:t>
+      </w:r>
+      <w:r>
+        <w:t xml:space="preserve"> (Indian Rupees </w:t>
       </w:r>
       <w:r>
         <w:rPr>
           <w:b/>
-          <w:bCs/>
-        </w:rPr>
-        <w:t xml:space="preserve"> </w:t>
-      </w:r>
-      <w:r>
-        <w:rPr>
-          <w:b/>
-          <w:bCs/>
-          <w:highlight w:val="yellow"/>
-        </w:rPr>
-        <w:t>“JOINING DATE”</w:t>
-      </w:r>
-      <w:r>
-        <w:t xml:space="preserve"> </w:t>
-      </w:r>
-      <w:r>
-        <w:t>(“Commencement Date”). The Employee acknowledges that h</w:t>
-      </w:r>
-      <w:r>
-        <w:t>is</w:t>
-      </w:r>
-      <w:r>
-        <w:t xml:space="preserve"> appointment is conditional upon satisfactory completion of all pre-employment requirements, including verification of credentials.</w:t>
-      </w:r>
-    </w:p>
-    <w:p>
-      <w:r>
-        <w:rPr>
-          <w:rFonts w:asciiTheme="majorHAnsi" w:hAnsiTheme="majorHAnsi" w:cstheme="majorHAnsi"/>
-        </w:rPr>
-        <w:t>The Employee undertakes to furnish full, complete, and accurate information regarding h</w:t>
-      </w:r>
-      <w:r>
-        <w:rPr>
-          <w:rFonts w:asciiTheme="majorHAnsi" w:hAnsiTheme="majorHAnsi" w:cstheme="majorHAnsi"/>
-        </w:rPr>
-        <w:t>is</w:t>
-      </w:r>
-      <w:r>
-        <w:rPr>
-          <w:rFonts w:asciiTheme="majorHAnsi" w:hAnsiTheme="majorHAnsi" w:cstheme="majorHAnsi"/>
-        </w:rPr>
-        <w:t xml:space="preserve"> personal details, qualifications, and previous employment, if any. If any declaration, statement, or information provided by the Employee is found to be false, misleading, incomplete, or if any material fact is </w:t>
-      </w:r>
-      <w:r>
-        <w:rPr>
-          <w:rFonts w:asciiTheme="majorHAnsi" w:hAnsiTheme="majorHAnsi" w:cstheme="majorHAnsi"/>
-        </w:rPr>
-        <w:t>willfully</w:t>
-      </w:r>
-      <w:r>
-        <w:rPr>
-          <w:rFonts w:asciiTheme="majorHAnsi" w:hAnsiTheme="majorHAnsi" w:cstheme="majorHAnsi"/>
-        </w:rPr>
-        <w:t xml:space="preserve"> suppressed, the Company shall be entitled to terminate the Employee’s services forthwith, without any notice or compensation, and without prejudice to any legal or equitable remedies available to the Company.</w:t>
-      </w:r>
-      <w:r>
-        <w:br/>
-      </w:r>
-      <w:r>
-        <w:br/>
-      </w:r>
-      <w:r>
-        <w:br/>
-      </w:r>
-      <w:r>
-        <w:lastRenderedPageBreak/>
-        <w:t xml:space="preserve">3. The Employee shall be on probation for a period of three (3) months from the Commencement Date, which may be extended at the Company’s sole discretion by up to an additional three (3) months. During the probation period (including any extension), the </w:t>
-      </w:r>
-      <w:r>
-        <w:t>Employee’s performance, conduct, and suitability for the role shall be under continuous review, and h</w:t>
-      </w:r>
-      <w:r>
-        <w:t xml:space="preserve">is </w:t>
-      </w:r>
-      <w:r>
-        <w:t>employment may be terminated by the Company at any time, without assigning any reason, by providing seven (7) days’ prior written notice or salary in lieu thereof. The Employee may terminate h</w:t>
-      </w:r>
-      <w:r>
-        <w:t>is</w:t>
-      </w:r>
-      <w:r>
-        <w:t xml:space="preserve"> employment during the probationary period only upon providing thirty (30) days’ prior written notice to the Company, or, at the Company’s discretion, by paying to the Company an amount equivalent to the gross salary for the unserved portion of such notice period.</w:t>
-      </w:r>
-      <w:r>
-        <w:br/>
-      </w:r>
-      <w:r>
-        <w:br/>
-        <w:t xml:space="preserve">4. The Employee shall primarily work from the Company’s </w:t>
-      </w:r>
-      <w:proofErr w:type="spellStart"/>
-      <w:r>
-        <w:t>ZenZebra</w:t>
-      </w:r>
-      <w:proofErr w:type="spellEnd"/>
-      <w:r>
-        <w:t xml:space="preserve"> HQ, New Delhi. Notwithstanding the foregoing, the Employee acknowledges and agrees that the Company may, at its sole discretion, require h</w:t>
-      </w:r>
-      <w:r>
-        <w:t>im</w:t>
-      </w:r>
-      <w:r>
-        <w:t xml:space="preserve"> to work from any other location or remotely. Normal working days shall be Monday to Saturday; working hours shall be as prescribed by the Company and may be altered from time to time without additional compensation, subject to applicable law.</w:t>
-      </w:r>
-      <w:r>
-        <w:br/>
-      </w:r>
-      <w:r>
-        <w:br/>
-        <w:t xml:space="preserve">5. The Employee shall receive a gross monthly salary of </w:t>
-      </w:r>
-      <w:r>
-        <w:rPr>
-          <w:b/>
-          <w:bCs/>
-        </w:rPr>
-        <w:t xml:space="preserve">INR </w:t>
-      </w:r>
-      <w:r>
-        <w:rPr>
-          <w:b/>
-          <w:bCs/>
-          <w:highlight w:val="yellow"/>
-        </w:rPr>
-        <w:t>“MONTHLY CTC”</w:t>
-      </w:r>
-      <w:r>
-        <w:t xml:space="preserve"> (Indian Rupees </w:t>
-      </w:r>
-      <w:r>
-        <w:rPr>
-          <w:b/>
-          <w:bCs/>
-          <w:highlight w:val="yellow"/>
-        </w:rPr>
-        <w:t>“MONTHLY CTC IN WORDS”</w:t>
+        </w:rPr>
+        <w:t>Fifty Four Thousand One Hundred Sixty Seven Rupees Only</w:t>
       </w:r>
       <w:r>
         <w:t xml:space="preserve"> only), subject to applicable deductions. The Company may, at its sole and absolute discretion, grant a performance-based bonus, which shall be contingent upon the performance of the Company and the Employee. Any bonus paid shall be discretionary, shall not form part of the Employee’s salary, and shall not constitute any precedent or create an entitlement in any subsequent year.</w:t>
@@ -714,18 +716,7 @@
             <w:hideMark/>
           </w:tcPr>
           <w:p>
-            <w:pPr>
-              <w:spacing w:after="0" w:line="240" w:lineRule="auto"/>
-              <w:rPr>
-                <w:rFonts w:ascii="Calibri" w:eastAsia="Times New Roman" w:hAnsi="Calibri" w:cs="Calibri"/>
-                <w:color w:val="000000"/>
-              </w:rPr>
-            </w:pPr>
-            <w:r>
-              <w:rPr>
-                <w:rFonts w:ascii="Calibri" w:eastAsia="Times New Roman" w:hAnsi="Calibri" w:cs="Calibri"/>
-                <w:color w:val="000000"/>
-              </w:rPr>
+            <w:r>
               <w:t>-</w:t>
             </w:r>
           </w:p>
@@ -745,18 +736,7 @@
             <w:hideMark/>
           </w:tcPr>
           <w:p>
-            <w:pPr>
-              <w:spacing w:after="0" w:line="240" w:lineRule="auto"/>
-              <w:rPr>
-                <w:rFonts w:ascii="Calibri" w:eastAsia="Times New Roman" w:hAnsi="Calibri" w:cs="Calibri"/>
-                <w:color w:val="000000"/>
-              </w:rPr>
-            </w:pPr>
-            <w:r>
-              <w:rPr>
-                <w:rFonts w:ascii="Calibri" w:eastAsia="Times New Roman" w:hAnsi="Calibri" w:cs="Calibri"/>
-                <w:color w:val="000000"/>
-              </w:rPr>
+            <w:r>
               <w:t>-</w:t>
             </w:r>
           </w:p>
@@ -814,18 +794,7 @@
             <w:hideMark/>
           </w:tcPr>
           <w:p>
-            <w:pPr>
-              <w:spacing w:after="0" w:line="240" w:lineRule="auto"/>
-              <w:rPr>
-                <w:rFonts w:ascii="Calibri" w:eastAsia="Times New Roman" w:hAnsi="Calibri" w:cs="Calibri"/>
-                <w:color w:val="000000"/>
-              </w:rPr>
-            </w:pPr>
-            <w:r>
-              <w:rPr>
-                <w:rFonts w:ascii="Calibri" w:eastAsia="Times New Roman" w:hAnsi="Calibri" w:cs="Calibri"/>
-                <w:color w:val="000000"/>
-              </w:rPr>
+            <w:r>
               <w:t>-</w:t>
             </w:r>
           </w:p>
@@ -845,18 +814,7 @@
             <w:hideMark/>
           </w:tcPr>
           <w:p>
-            <w:pPr>
-              <w:spacing w:after="0" w:line="240" w:lineRule="auto"/>
-              <w:rPr>
-                <w:rFonts w:ascii="Calibri" w:eastAsia="Times New Roman" w:hAnsi="Calibri" w:cs="Calibri"/>
-                <w:color w:val="000000"/>
-              </w:rPr>
-            </w:pPr>
-            <w:r>
-              <w:rPr>
-                <w:rFonts w:ascii="Calibri" w:eastAsia="Times New Roman" w:hAnsi="Calibri" w:cs="Calibri"/>
-                <w:color w:val="000000"/>
-              </w:rPr>
+            <w:r>
               <w:t>-</w:t>
             </w:r>
           </w:p>
@@ -914,18 +872,7 @@
             <w:hideMark/>
           </w:tcPr>
           <w:p>
-            <w:pPr>
-              <w:spacing w:after="0" w:line="240" w:lineRule="auto"/>
-              <w:rPr>
-                <w:rFonts w:ascii="Calibri" w:eastAsia="Times New Roman" w:hAnsi="Calibri" w:cs="Calibri"/>
-                <w:color w:val="000000"/>
-              </w:rPr>
-            </w:pPr>
-            <w:r>
-              <w:rPr>
-                <w:rFonts w:ascii="Calibri" w:eastAsia="Times New Roman" w:hAnsi="Calibri" w:cs="Calibri"/>
-                <w:color w:val="000000"/>
-              </w:rPr>
+            <w:r>
               <w:t>-</w:t>
             </w:r>
           </w:p>
@@ -945,18 +892,7 @@
             <w:hideMark/>
           </w:tcPr>
           <w:p>
-            <w:pPr>
-              <w:spacing w:after="0" w:line="240" w:lineRule="auto"/>
-              <w:rPr>
-                <w:rFonts w:ascii="Calibri" w:eastAsia="Times New Roman" w:hAnsi="Calibri" w:cs="Calibri"/>
-                <w:color w:val="000000"/>
-              </w:rPr>
-            </w:pPr>
-            <w:r>
-              <w:rPr>
-                <w:rFonts w:ascii="Calibri" w:eastAsia="Times New Roman" w:hAnsi="Calibri" w:cs="Calibri"/>
-                <w:color w:val="000000"/>
-              </w:rPr>
+            <w:r>
               <w:t>-</w:t>
             </w:r>
           </w:p>
@@ -1014,18 +950,7 @@
             <w:hideMark/>
           </w:tcPr>
           <w:p>
-            <w:pPr>
-              <w:spacing w:after="0" w:line="240" w:lineRule="auto"/>
-              <w:rPr>
-                <w:rFonts w:ascii="Calibri" w:eastAsia="Times New Roman" w:hAnsi="Calibri" w:cs="Calibri"/>
-                <w:color w:val="000000"/>
-              </w:rPr>
-            </w:pPr>
-            <w:r>
-              <w:rPr>
-                <w:rFonts w:ascii="Calibri" w:eastAsia="Times New Roman" w:hAnsi="Calibri" w:cs="Calibri"/>
-                <w:color w:val="000000"/>
-              </w:rPr>
+            <w:r>
               <w:t>-</w:t>
             </w:r>
           </w:p>
@@ -1045,18 +970,7 @@
             <w:hideMark/>
           </w:tcPr>
           <w:p>
-            <w:pPr>
-              <w:spacing w:after="0" w:line="240" w:lineRule="auto"/>
-              <w:rPr>
-                <w:rFonts w:ascii="Calibri" w:eastAsia="Times New Roman" w:hAnsi="Calibri" w:cs="Calibri"/>
-                <w:color w:val="000000"/>
-              </w:rPr>
-            </w:pPr>
-            <w:r>
-              <w:rPr>
-                <w:rFonts w:ascii="Calibri" w:eastAsia="Times New Roman" w:hAnsi="Calibri" w:cs="Calibri"/>
-                <w:color w:val="000000"/>
-              </w:rPr>
+            <w:r>
               <w:t>-</w:t>
             </w:r>
           </w:p>
@@ -1114,18 +1028,7 @@
             <w:hideMark/>
           </w:tcPr>
           <w:p>
-            <w:pPr>
-              <w:spacing w:after="0" w:line="240" w:lineRule="auto"/>
-              <w:rPr>
-                <w:rFonts w:ascii="Calibri" w:eastAsia="Times New Roman" w:hAnsi="Calibri" w:cs="Calibri"/>
-                <w:color w:val="000000"/>
-              </w:rPr>
-            </w:pPr>
-            <w:r>
-              <w:rPr>
-                <w:rFonts w:ascii="Calibri" w:eastAsia="Times New Roman" w:hAnsi="Calibri" w:cs="Calibri"/>
-                <w:color w:val="000000"/>
-              </w:rPr>
+            <w:r>
               <w:t>-</w:t>
             </w:r>
           </w:p>
@@ -1145,18 +1048,7 @@
             <w:hideMark/>
           </w:tcPr>
           <w:p>
-            <w:pPr>
-              <w:spacing w:after="0" w:line="240" w:lineRule="auto"/>
-              <w:rPr>
-                <w:rFonts w:ascii="Calibri" w:eastAsia="Times New Roman" w:hAnsi="Calibri" w:cs="Calibri"/>
-                <w:color w:val="000000"/>
-              </w:rPr>
-            </w:pPr>
-            <w:r>
-              <w:rPr>
-                <w:rFonts w:ascii="Calibri" w:eastAsia="Times New Roman" w:hAnsi="Calibri" w:cs="Calibri"/>
-                <w:color w:val="000000"/>
-              </w:rPr>
+            <w:r>
               <w:t>-</w:t>
             </w:r>
           </w:p>
@@ -1214,18 +1106,7 @@
             <w:hideMark/>
           </w:tcPr>
           <w:p>
-            <w:pPr>
-              <w:spacing w:after="0" w:line="240" w:lineRule="auto"/>
-              <w:rPr>
-                <w:rFonts w:ascii="Calibri" w:eastAsia="Times New Roman" w:hAnsi="Calibri" w:cs="Calibri"/>
-                <w:color w:val="000000"/>
-              </w:rPr>
-            </w:pPr>
-            <w:r>
-              <w:rPr>
-                <w:rFonts w:ascii="Calibri" w:eastAsia="Times New Roman" w:hAnsi="Calibri" w:cs="Calibri"/>
-                <w:color w:val="000000"/>
-              </w:rPr>
+            <w:r>
               <w:t>-</w:t>
             </w:r>
           </w:p>
@@ -1245,18 +1126,7 @@
             <w:hideMark/>
           </w:tcPr>
           <w:p>
-            <w:pPr>
-              <w:spacing w:after="0" w:line="240" w:lineRule="auto"/>
-              <w:rPr>
-                <w:rFonts w:ascii="Calibri" w:eastAsia="Times New Roman" w:hAnsi="Calibri" w:cs="Calibri"/>
-                <w:color w:val="000000"/>
-              </w:rPr>
-            </w:pPr>
-            <w:r>
-              <w:rPr>
-                <w:rFonts w:ascii="Calibri" w:eastAsia="Times New Roman" w:hAnsi="Calibri" w:cs="Calibri"/>
-                <w:color w:val="000000"/>
-              </w:rPr>
+            <w:r>
               <w:t>-</w:t>
             </w:r>
           </w:p>
@@ -1406,18 +1276,7 @@
             <w:hideMark/>
           </w:tcPr>
           <w:p>
-            <w:pPr>
-              <w:spacing w:after="0" w:line="240" w:lineRule="auto"/>
-              <w:rPr>
-                <w:rFonts w:ascii="Calibri" w:eastAsia="Times New Roman" w:hAnsi="Calibri" w:cs="Calibri"/>
-                <w:color w:val="000000"/>
-              </w:rPr>
-            </w:pPr>
-            <w:r>
-              <w:rPr>
-                <w:rFonts w:ascii="Calibri" w:eastAsia="Times New Roman" w:hAnsi="Calibri" w:cs="Calibri"/>
-                <w:color w:val="000000"/>
-              </w:rPr>
+            <w:r>
               <w:t>-</w:t>
             </w:r>
           </w:p>
@@ -1437,18 +1296,7 @@
             <w:hideMark/>
           </w:tcPr>
           <w:p>
-            <w:pPr>
-              <w:spacing w:after="0" w:line="240" w:lineRule="auto"/>
-              <w:rPr>
-                <w:rFonts w:ascii="Calibri" w:eastAsia="Times New Roman" w:hAnsi="Calibri" w:cs="Calibri"/>
-                <w:color w:val="000000"/>
-              </w:rPr>
-            </w:pPr>
-            <w:r>
-              <w:rPr>
-                <w:rFonts w:ascii="Calibri" w:eastAsia="Times New Roman" w:hAnsi="Calibri" w:cs="Calibri"/>
-                <w:color w:val="000000"/>
-              </w:rPr>
+            <w:r>
               <w:t>-</w:t>
             </w:r>
           </w:p>
@@ -1506,18 +1354,7 @@
             <w:hideMark/>
           </w:tcPr>
           <w:p>
-            <w:pPr>
-              <w:spacing w:after="0" w:line="240" w:lineRule="auto"/>
-              <w:rPr>
-                <w:rFonts w:ascii="Calibri" w:eastAsia="Times New Roman" w:hAnsi="Calibri" w:cs="Calibri"/>
-                <w:color w:val="000000"/>
-              </w:rPr>
-            </w:pPr>
-            <w:r>
-              <w:rPr>
-                <w:rFonts w:ascii="Calibri" w:eastAsia="Times New Roman" w:hAnsi="Calibri" w:cs="Calibri"/>
-                <w:color w:val="000000"/>
-              </w:rPr>
+            <w:r>
               <w:t>-</w:t>
             </w:r>
           </w:p>
@@ -1537,18 +1374,7 @@
             <w:hideMark/>
           </w:tcPr>
           <w:p>
-            <w:pPr>
-              <w:spacing w:after="0" w:line="240" w:lineRule="auto"/>
-              <w:rPr>
-                <w:rFonts w:ascii="Calibri" w:eastAsia="Times New Roman" w:hAnsi="Calibri" w:cs="Calibri"/>
-                <w:color w:val="000000"/>
-              </w:rPr>
-            </w:pPr>
-            <w:r>
-              <w:rPr>
-                <w:rFonts w:ascii="Calibri" w:eastAsia="Times New Roman" w:hAnsi="Calibri" w:cs="Calibri"/>
-                <w:color w:val="000000"/>
-              </w:rPr>
+            <w:r>
               <w:t>-</w:t>
             </w:r>
           </w:p>
@@ -1610,22 +1436,7 @@
             <w:hideMark/>
           </w:tcPr>
           <w:p>
-            <w:pPr>
-              <w:spacing w:after="0" w:line="240" w:lineRule="auto"/>
-              <w:rPr>
-                <w:rFonts w:ascii="Calibri" w:eastAsia="Times New Roman" w:hAnsi="Calibri" w:cs="Calibri"/>
-                <w:b/>
-                <w:bCs/>
-                <w:color w:val="000000"/>
-              </w:rPr>
-            </w:pPr>
-            <w:r>
-              <w:rPr>
-                <w:rFonts w:ascii="Calibri" w:eastAsia="Times New Roman" w:hAnsi="Calibri" w:cs="Calibri"/>
-                <w:b/>
-                <w:bCs/>
-                <w:color w:val="000000"/>
-              </w:rPr>
+            <w:r>
               <w:t>-</w:t>
             </w:r>
           </w:p>
@@ -1645,22 +1456,7 @@
             <w:hideMark/>
           </w:tcPr>
           <w:p>
-            <w:pPr>
-              <w:spacing w:after="0" w:line="240" w:lineRule="auto"/>
-              <w:rPr>
-                <w:rFonts w:ascii="Calibri" w:eastAsia="Times New Roman" w:hAnsi="Calibri" w:cs="Calibri"/>
-                <w:b/>
-                <w:bCs/>
-                <w:color w:val="000000"/>
-              </w:rPr>
-            </w:pPr>
-            <w:r>
-              <w:rPr>
-                <w:rFonts w:ascii="Calibri" w:eastAsia="Times New Roman" w:hAnsi="Calibri" w:cs="Calibri"/>
-                <w:b/>
-                <w:bCs/>
-                <w:color w:val="000000"/>
-              </w:rPr>
+            <w:r>
               <w:t>-</w:t>
             </w:r>
           </w:p>
@@ -1670,7 +1466,7 @@
         <w:trPr>
           <w:gridAfter w:val="1"/>
           <w:wAfter w:w="236" w:type="dxa"/>
-          <w:trHeight w:val="408"/>
+          <w:trHeight w:val="450"/>
         </w:trPr>
         <w:tc>
           <w:tcPr>
@@ -1766,6 +1562,7 @@
     </w:p>
     <w:p>
       <w:r>
+        <w:lastRenderedPageBreak/>
         <w:br/>
       </w:r>
     </w:p>
@@ -1803,13 +1600,7 @@
       </w:r>
       <w:r>
         <w:br/>
-        <w:t>7. The Employee shall devote h</w:t>
-      </w:r>
-      <w:r>
-        <w:t>is</w:t>
-      </w:r>
-      <w:r>
-        <w:t xml:space="preserve"> full professional time and attention exclusively to the Company’s business, faithfully discharge all duties assigned and comply with all instructions and policies, avoid any conduct prejudicial to the Company’s reputation or interests. The Employee shall not, without the prior written consent of the Company:</w:t>
+        <w:t>7. The Employee shall devote his full professional time and attention exclusively to the Company’s business, faithfully discharge all duties assigned and comply with all instructions and policies, avoid any conduct prejudicial to the Company’s reputation or interests. The Employee shall not, without the prior written consent of the Company:</w:t>
       </w:r>
     </w:p>
     <w:p>
@@ -1821,19 +1612,7 @@
         </w:numPr>
       </w:pPr>
       <w:r>
-        <w:t>directly or indirectly engage in any external business, employment, or professional activity, which is similar to, connected with, or competitive with the business of the Company, or which could reasonably be considered to impair h</w:t>
-      </w:r>
-      <w:r>
-        <w:t>is</w:t>
-      </w:r>
-      <w:r>
-        <w:t xml:space="preserve"> ability to act at all times in the best interests of the Company, outside h</w:t>
-      </w:r>
-      <w:r>
-        <w:t>is</w:t>
-      </w:r>
-      <w:r>
-        <w:t xml:space="preserve"> hours of work for the Company;</w:t>
+        <w:t>directly or indirectly engage in any external business, employment, or professional activity, which is similar to, connected with, or competitive with the business of the Company, or which could reasonably be considered to impair his ability to act at all times in the best interests of the Company, outside his hours of work for the Company;</w:t>
       </w:r>
     </w:p>
     <w:p>
@@ -1885,6 +1664,7 @@
         <w:br/>
       </w:r>
       <w:r>
+        <w:lastRenderedPageBreak/>
         <w:br/>
       </w:r>
     </w:p>
@@ -1898,86 +1678,53 @@
         <w:ind w:left="45"/>
       </w:pPr>
       <w:r>
+        <w:t>11. The Employee may terminate his employment only upon giving the Company not less than three (3) calendar months’ prior written notice; failure to serve the full notice shall render him liable to pay to the Company an amount equivalent to the gross salary for the unserved portion, which the Company may recover by deduction from amounts payable to him. The Company may terminate employment without cause upon giving one (1) calendar month’s prior written notice or salary in lieu thereof. The Company may terminate the Employee immediately and without notice in cases of misconduct, gross negligence, breach of this Agreement, breach of confidentiality, or conduct prejudicial to the Company’s interests. The Company may, during any notice period, at its sole discretion, direct the Employee not to attend the workplace, to work remotely, or to refrain from performing certain duties, while continuing to pay his salary. All final payments, relieving letters, and experience certificates shall be conditional upon full compliance with handover obligations and settlement of all dues owed to the Company.</w:t>
+      </w:r>
+      <w:r>
+        <w:br/>
+      </w:r>
+      <w:r>
+        <w:br/>
+        <w:t>12. Upon Termination of the employment, the Employee shall a) provide complete handover of all work, documents, and access credentials; b) return all Company property, including but not limited to hardware, software, data storage devices, records and any other materials belonging to the Company; and c) permanently delete any Company data from personal devices and certify such deletion in writing.</w:t>
+      </w:r>
+      <w:r>
+        <w:br/>
+      </w:r>
+      <w:r>
+        <w:br/>
+        <w:t>13. The Employee shall fully indemnify and hold harmless the Company, its officers, and affiliates from and against any and all losses, liabilities, claims, damages, and expenses (including legal fees) arising directly or indirectly from a) any breach of this Agreement by the Employee; b) any act, omission or negligence of the Employee in the performance of his duties; or c) any misrepresentation, fraud, or willful misconduct by the Employee.</w:t>
+      </w:r>
+      <w:r>
+        <w:br/>
+      </w:r>
+      <w:r>
+        <w:br/>
+        <w:t>14. The Employee acknowledges that monetary damages may be inadequate for certain breaches, and that the Company shall be entitled to specific performance, interim relief, and permanent injunction without proof of special damage, in addition to any other remedies available at law or in equity.</w:t>
+      </w:r>
+      <w:r>
+        <w:br/>
+      </w:r>
+      <w:r>
+        <w:br/>
+        <w:t>15. In the event of legal, arbitration or other proceedings to enforce this Agreement, the Employee shall bear all costs, fees, and expenses incurred by the Company, including attorney’s fees, unless the adjudicating body rules entirely in his favor.</w:t>
+      </w:r>
+      <w:r>
+        <w:br/>
+      </w:r>
+      <w:r>
+        <w:br/>
+        <w:t>16. All disputes arising out of or relating to this Agreement shall be resolved exclusively by binding arbitration under the Arbitration and Conciliation Act, 1996. The arbitration shall be conducted by a sole arbitrator, with the seat and venue in New Delhi, and the language of proceedings being English. The arbitral award shall be final and binding, and enforceable in any competent court of law.</w:t>
+      </w:r>
+      <w:r>
+        <w:br/>
+      </w:r>
+      <w:r>
+        <w:br/>
+        <w:t xml:space="preserve">17. All obligations under Clauses 8, 9, 10, 13, 14, 15, and 16 shall survive Termination indefinitely. The remedies </w:t>
+      </w:r>
+      <w:r>
         <w:lastRenderedPageBreak/>
-        <w:t>11. The Employee may terminate h</w:t>
-      </w:r>
-      <w:r>
-        <w:t>is</w:t>
-      </w:r>
-      <w:r>
-        <w:t xml:space="preserve"> employment only upon giving the Company not less than three (3) calendar months’ prior written notice; failure to serve the full notice shall render h</w:t>
-      </w:r>
-      <w:r>
-        <w:t>im</w:t>
-      </w:r>
-      <w:r>
-        <w:t xml:space="preserve"> liable to pay to the Company an amount equivalent to the gross salary for the unserved portion, which the Company may recover by deduction from amounts payable to h</w:t>
-      </w:r>
-      <w:r>
-        <w:t>im</w:t>
-      </w:r>
-      <w:r>
-        <w:t>. The Company may terminate employment without cause upon giving one (1) calendar month’s prior written notice or salary in lieu thereof. The Company may terminate the Employee immediately and without notice in cases of misconduct, gross negligence, breach of this Agreement, breach of confidentiality, or conduct prejudicial to the Company’s interests. The Company may, during any notice period, at its sole discretion, direct the Employee not to attend the workplace, to work remotely, or to refrain from performing certain duties, while continuing to pay h</w:t>
-      </w:r>
-      <w:r>
-        <w:t>is</w:t>
-      </w:r>
-      <w:r>
-        <w:t xml:space="preserve"> salary. All final payments, relieving letters, and experience certificates shall be conditional upon full compliance with handover obligations and settlement of all dues owed to the Company.</w:t>
-      </w:r>
-      <w:r>
-        <w:br/>
-      </w:r>
-      <w:r>
-        <w:br/>
-        <w:t>12. Upon Termination of the employment, the Employee shall a) provide complete handover of all work, documents, and access credentials; b) return all Company property, including but not limited to hardware, software, data storage devices, records and any other materials belonging to the Company; and c) permanently delete any Company data from personal devices and certify such deletion in writing.</w:t>
-      </w:r>
-      <w:r>
-        <w:br/>
-      </w:r>
-      <w:r>
-        <w:br/>
-        <w:t>13. The Employee shall fully indemnify and hold harmless the Company, its officers, and affiliates from and against any and all losses, liabilities, claims, damages, and expenses (including legal fees) arising directly or indirectly from a) any breach of this Agreement by the Employee; b) any act, omission or negligence of the Employee in the performance of h</w:t>
-      </w:r>
-      <w:r>
-        <w:t>is</w:t>
-      </w:r>
-      <w:r>
-        <w:t xml:space="preserve"> duties; or c) any misrepresentation, fraud, or willful misconduct by the Employee.</w:t>
-      </w:r>
-      <w:r>
-        <w:br/>
-      </w:r>
-      <w:r>
-        <w:br/>
-        <w:t>14. The Employee acknowledges that monetary damages may be inadequate for certain breaches, and that the Company shall be entitled to specific performance, interim relief, and permanent injunction without proof of special damage, in addition to any other remedies available at law or in equity.</w:t>
-      </w:r>
-      <w:r>
-        <w:br/>
-      </w:r>
-      <w:r>
-        <w:br/>
-        <w:t>15. In the event of legal, arbitration or other proceedings to enforce this Agreement, the Employee shall bear all costs, fees, and expenses incurred by the Company, including attorney’s fees, unless the adjudicating body rules entirely in h</w:t>
-      </w:r>
-      <w:r>
-        <w:t>is</w:t>
-      </w:r>
-      <w:r>
-        <w:t xml:space="preserve"> favor.</w:t>
-      </w:r>
-      <w:r>
-        <w:br/>
-      </w:r>
-      <w:r>
-        <w:br/>
-        <w:t>16. All disputes arising out of or relating to this Agreement shall be resolved exclusively by binding arbitration under the Arbitration and Conciliation Act, 1996. The arbitration shall be conducted by a sole arbitrator, with the seat and venue in New Delhi, and the language of proceedings being English. The arbitral award shall be final and binding, and enforceable in any competent court of law.</w:t>
-      </w:r>
-      <w:r>
-        <w:br/>
-      </w:r>
-      <w:r>
-        <w:br/>
-        <w:t>17. All obligations under Clauses 8, 9, 10, 13, 14, 15, and 16 shall survive Termination indefinitely. The remedies provided herein are cumulative and may be exercised concurrently, and are in addition to any other remedies available</w:t>
+        <w:t>provided herein are cumulative and may be exercised concurrently, and are in addition to any other remedies available</w:t>
       </w:r>
       <w:r>
         <w:t xml:space="preserve"> at law or in equity.</w:t>
@@ -1991,7 +1738,186 @@
         <w:ind w:left="45"/>
       </w:pPr>
       <w:r>
-        <w:lastRenderedPageBreak/>
+        <w:rPr>
+          <w:noProof/>
+        </w:rPr>
+        <mc:AlternateContent>
+          <mc:Choice Requires="wps">
+            <w:drawing>
+              <wp:anchor distT="45720" distB="45720" distL="114300" distR="114300" simplePos="0" relativeHeight="251659264" behindDoc="0" locked="0" layoutInCell="1" allowOverlap="1" wp14:anchorId="22DDD827" wp14:editId="2AC26EBD">
+                <wp:simplePos x="0" y="0"/>
+                <wp:positionH relativeFrom="column">
+                  <wp:posOffset>3609340</wp:posOffset>
+                </wp:positionH>
+                <wp:positionV relativeFrom="paragraph">
+                  <wp:posOffset>1910080</wp:posOffset>
+                </wp:positionV>
+                <wp:extent cx="2360930" cy="1404620"/>
+                <wp:effectExtent l="0" t="0" r="0" b="8890"/>
+                <wp:wrapSquare wrapText="bothSides"/>
+                <wp:docPr id="217" name="Text Box 2"/>
+                <wp:cNvGraphicFramePr>
+                  <a:graphicFrameLocks xmlns:a="http://schemas.openxmlformats.org/drawingml/2006/main"/>
+                </wp:cNvGraphicFramePr>
+                <a:graphic xmlns:a="http://schemas.openxmlformats.org/drawingml/2006/main">
+                  <a:graphicData uri="http://schemas.microsoft.com/office/word/2010/wordprocessingShape">
+                    <wps:wsp>
+                      <wps:cNvSpPr txBox="1">
+                        <a:spLocks noChangeArrowheads="1"/>
+                      </wps:cNvSpPr>
+                      <wps:spPr bwMode="auto">
+                        <a:xfrm>
+                          <a:off x="0" y="0"/>
+                          <a:ext cx="2360930" cy="1404620"/>
+                        </a:xfrm>
+                        <a:prstGeom prst="rect">
+                          <a:avLst/>
+                        </a:prstGeom>
+                        <a:solidFill>
+                          <a:srgbClr val="FFFFFF"/>
+                        </a:solidFill>
+                        <a:ln w="9525">
+                          <a:noFill/>
+                          <a:miter lim="800000"/>
+                          <a:headEnd/>
+                          <a:tailEnd/>
+                        </a:ln>
+                      </wps:spPr>
+                      <wps:txbx>
+                        <w:txbxContent>
+                          <w:p>
+                            <w:pPr>
+                              <w:ind w:left="45"/>
+                            </w:pPr>
+                            <w:r>
+                              <w:t>Employee</w:t>
+                            </w:r>
+                            <w:r>
+                              <w:br/>
+                            </w:r>
+                            <w:r>
+                              <w:br/>
+                            </w:r>
+                            <w:r>
+                              <w:br/>
+                            </w:r>
+                            <w:r>
+                              <w:br/>
+                            </w:r>
+                            <w:r>
+                              <w:br/>
+                            </w:r>
+                            <w:r>
+                              <w:br/>
+                              <w:t>Signature: ____________________</w:t>
+                            </w:r>
+                            <w:r>
+                              <w:br/>
+                              <w:t xml:space="preserve">Name: </w:t>
+                            </w:r>
+                            <w:r>
+                              <w:rPr>
+                                <w:b/>
+                              </w:rPr>
+                              <w:t xml:space="preserve">Parthasarathi </w:t>
+                            </w:r>
+                            <w:proofErr w:type="spellStart"/>
+                            <w:r>
+                              <w:rPr>
+                                <w:b/>
+                              </w:rPr>
+                              <w:t>Behura</w:t>
+                            </w:r>
+                            <w:proofErr w:type="spellEnd"/>
+                            <w:r>
+                              <w:br/>
+                            </w:r>
+                          </w:p>
+                          <w:p/>
+                        </w:txbxContent>
+                      </wps:txbx>
+                      <wps:bodyPr rot="0" vert="horz" wrap="square" lIns="91440" tIns="45720" rIns="91440" bIns="45720" anchor="t" anchorCtr="0">
+                        <a:spAutoFit/>
+                      </wps:bodyPr>
+                    </wps:wsp>
+                  </a:graphicData>
+                </a:graphic>
+                <wp14:sizeRelH relativeFrom="margin">
+                  <wp14:pctWidth>40000</wp14:pctWidth>
+                </wp14:sizeRelH>
+                <wp14:sizeRelV relativeFrom="margin">
+                  <wp14:pctHeight>20000</wp14:pctHeight>
+                </wp14:sizeRelV>
+              </wp:anchor>
+            </w:drawing>
+          </mc:Choice>
+          <mc:Fallback>
+            <w:pict>
+              <v:shapetype w14:anchorId="22DDD827" id="_x0000_t202" coordsize="21600,21600" o:spt="202" path="m,l,21600r21600,l21600,xe">
+                <v:stroke joinstyle="miter"/>
+                <v:path gradientshapeok="t" o:connecttype="rect"/>
+              </v:shapetype>
+              <v:shape id="Text Box 2" o:spid="_x0000_s1026" type="#_x0000_t202" style="position:absolute;left:0;text-align:left;margin-left:284.2pt;margin-top:150.4pt;width:185.9pt;height:110.6pt;z-index:251659264;visibility:visible;mso-wrap-style:square;mso-width-percent:400;mso-height-percent:200;mso-wrap-distance-left:9pt;mso-wrap-distance-top:3.6pt;mso-wrap-distance-right:9pt;mso-wrap-distance-bottom:3.6pt;mso-position-horizontal:absolute;mso-position-horizontal-relative:text;mso-position-vertical:absolute;mso-position-vertical-relative:text;mso-width-percent:400;mso-height-percent:200;mso-width-relative:margin;mso-height-relative:margin;v-text-anchor:top" o:gfxdata="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" stroked="f">
+                <v:textbox style="mso-fit-shape-to-text:t">
+                  <w:txbxContent>
+                    <w:p>
+                      <w:pPr>
+                        <w:ind w:left="45"/>
+                      </w:pPr>
+                      <w:r>
+                        <w:t>Employee</w:t>
+                      </w:r>
+                      <w:r>
+                        <w:br/>
+                      </w:r>
+                      <w:r>
+                        <w:br/>
+                      </w:r>
+                      <w:r>
+                        <w:br/>
+                      </w:r>
+                      <w:r>
+                        <w:br/>
+                      </w:r>
+                      <w:r>
+                        <w:br/>
+                      </w:r>
+                      <w:r>
+                        <w:br/>
+                        <w:t>Signature: ____________________</w:t>
+                      </w:r>
+                      <w:r>
+                        <w:br/>
+                        <w:t xml:space="preserve">Name: </w:t>
+                      </w:r>
+                      <w:r>
+                        <w:rPr>
+                          <w:b/>
+                        </w:rPr>
+                        <w:t xml:space="preserve">Parthasarathi </w:t>
+                      </w:r>
+                      <w:proofErr w:type="spellStart"/>
+                      <w:r>
+                        <w:rPr>
+                          <w:b/>
+                        </w:rPr>
+                        <w:t>Behura</w:t>
+                      </w:r>
+                      <w:proofErr w:type="spellEnd"/>
+                      <w:r>
+                        <w:br/>
+                      </w:r>
+                    </w:p>
+                    <w:p/>
+                  </w:txbxContent>
+                </v:textbox>
+                <w10:wrap type="square"/>
+              </v:shape>
+            </w:pict>
+          </mc:Fallback>
+        </mc:AlternateContent>
+      </w:r>
+      <w:r>
         <w:br/>
         <w:t xml:space="preserve">18. If any provision of this Agreement is held to be invalid, </w:t>
       </w:r>
@@ -2024,38 +1950,39 @@
       </w:r>
       <w:r>
         <w:br/>
+      </w:r>
+      <w:r>
+        <w:br/>
+      </w:r>
+      <w:r>
+        <w:br/>
+      </w:r>
+      <w:r>
+        <w:br/>
+      </w:r>
+      <w:r>
+        <w:br/>
+      </w:r>
+      <w:r>
+        <w:br/>
         <w:t>Authorized Signatory: ____________________</w:t>
       </w:r>
       <w:r>
         <w:br/>
-        <w:t>Name: ____________________</w:t>
-      </w:r>
-      <w:r>
-        <w:br/>
-        <w:t>Designation: ____________________</w:t>
-      </w:r>
-      <w:r>
-        <w:br/>
-      </w:r>
-      <w:r>
-        <w:br/>
-        <w:t>Employee</w:t>
-      </w:r>
-      <w:r>
-        <w:br/>
-        <w:t>Signature: ____________________</w:t>
-      </w:r>
-      <w:r>
-        <w:br/>
         <w:t xml:space="preserve">Name: </w:t>
       </w:r>
       <w:r>
-        <w:rPr>
-          <w:b/>
-          <w:bCs/>
-          <w:highlight w:val="yellow"/>
-        </w:rPr>
-        <w:t>“EMPLOYEE NAME”</w:t>
+        <w:t>Tanmay Jain</w:t>
+      </w:r>
+      <w:r>
+        <w:br/>
+        <w:t xml:space="preserve">Designation: </w:t>
+      </w:r>
+      <w:r>
+        <w:t>CEO</w:t>
+      </w:r>
+      <w:r>
+        <w:br/>
       </w:r>
       <w:r>
         <w:br/>

</xml_diff>

<commit_message>
Fix template name replacement, adjust table row spacing, restore original calculation math, and integrate new employee template
</commit_message>
<xml_diff>
--- a/templates/employee-contract-template.docx
+++ b/templates/employee-contract-template.docx
@@ -1,6 +1,6 @@
 
 <file path=word/document.xml><?xml version="1.0" encoding="utf-8"?>
-<w:document xmlns:wpc="http://schemas.microsoft.com/office/word/2010/wordprocessingCanvas" xmlns:cx="http://schemas.microsoft.com/office/drawing/2014/chartex" xmlns:cx1="http://schemas.microsoft.com/office/drawing/2015/9/8/chartex" xmlns:cx2="http://schemas.microsoft.com/office/drawing/2015/10/21/chartex" xmlns:cx3="http://schemas.microsoft.com/office/drawing/2016/5/9/chartex" xmlns:cx4="http://schemas.microsoft.com/office/drawing/2016/5/10/chartex" xmlns:cx5="http://schemas.microsoft.com/office/drawing/2016/5/11/chartex" xmlns:cx6="http://schemas.microsoft.com/office/drawing/2016/5/12/chartex" xmlns:cx7="http://schemas.microsoft.com/office/drawing/2016/5/13/chartex" xmlns:cx8="http://schemas.microsoft.com/office/drawing/2016/5/14/chartex" xmlns:mc="http://schemas.openxmlformats.org/markup-compatibility/2006" xmlns:aink="http://schemas.microsoft.com/office/drawing/2016/ink" xmlns:am3d="http://schemas.microsoft.com/office/drawing/2017/model3d" xmlns:o="urn:schemas-microsoft-com:office:office" xmlns:r="http://schemas.openxmlformats.org/officeDocument/2006/relationships" xmlns:m="http://schemas.openxmlformats.org/officeDocument/2006/math" xmlns:v="urn:schemas-microsoft-com:vml" xmlns:wp14="http://schemas.microsoft.com/office/word/2010/wordprocessingDrawing" xmlns:wp="http://schemas.openxmlformats.org/drawingml/2006/wordprocessingDrawing" xmlns:w10="urn:schemas-microsoft-com:office:word" xmlns:w="http://schemas.openxmlformats.org/wordprocessingml/2006/main" xmlns:w14="http://schemas.microsoft.com/office/word/2010/wordml" xmlns:w15="http://schemas.microsoft.com/office/word/2012/wordml" xmlns:w16cex="http://schemas.microsoft.com/office/word/2018/wordml/cex" xmlns:w16cid="http://schemas.microsoft.com/office/word/2016/wordml/cid" xmlns:w16="http://schemas.microsoft.com/office/word/2018/wordml" xmlns:w16sdtdh="http://schemas.microsoft.com/office/word/2020/wordml/sdtdatahash" xmlns:w16se="http://schemas.microsoft.com/office/word/2015/wordml/symex" xmlns:wpg="http://schemas.microsoft.com/office/word/2010/wordprocessingGroup" xmlns:wpi="http://schemas.microsoft.com/office/word/2010/wordprocessingInk" xmlns:wne="http://schemas.microsoft.com/office/word/2006/wordml" xmlns:wps="http://schemas.microsoft.com/office/word/2010/wordprocessingShape" mc:Ignorable="w14 w15 w16se w16cid w16 w16cex w16sdtdh wp14">
+<w:document xmlns:wpc="http://schemas.microsoft.com/office/word/2010/wordprocessingCanvas" xmlns:mc="http://schemas.openxmlformats.org/markup-compatibility/2006" xmlns:o="urn:schemas-microsoft-com:office:office" xmlns:r="http://schemas.openxmlformats.org/officeDocument/2006/relationships" xmlns:m="http://schemas.openxmlformats.org/officeDocument/2006/math" xmlns:v="urn:schemas-microsoft-com:vml" xmlns:wp14="http://schemas.microsoft.com/office/word/2010/wordprocessingDrawing" xmlns:wp="http://schemas.openxmlformats.org/drawingml/2006/wordprocessingDrawing" xmlns:w10="urn:schemas-microsoft-com:office:word" xmlns:w="http://schemas.openxmlformats.org/wordprocessingml/2006/main" xmlns:w14="http://schemas.microsoft.com/office/word/2010/wordml" xmlns:wpg="http://schemas.microsoft.com/office/word/2010/wordprocessingGroup" xmlns:wpi="http://schemas.microsoft.com/office/word/2010/wordprocessingInk" xmlns:wne="http://schemas.microsoft.com/office/word/2006/wordml" xmlns:wps="http://schemas.microsoft.com/office/word/2010/wordprocessingShape" mc:Ignorable="w14 wp14">
   <w:body>
     <w:p>
       <w:pPr>
@@ -45,7 +45,15 @@
           <w:sz w:val="18"/>
           <w:szCs w:val="18"/>
         </w:rPr>
-        <w:t xml:space="preserve">                                                                                                     </w:t>
+        <w:t xml:space="preserve">  </w:t>
+      </w:r>
+      <w:r>
+        <w:rPr>
+          <w:rFonts w:ascii="Arial" w:hAnsi="Arial" w:cs="Arial"/>
+          <w:sz w:val="18"/>
+          <w:szCs w:val="18"/>
+        </w:rPr>
+        <w:t xml:space="preserve"> </w:t>
       </w:r>
       <w:r>
         <w:rPr>
@@ -91,7 +99,7 @@
         </w:rPr>
         <w:t xml:space="preserve">Phone Nos.: 9910605187, 9958680856, Email ID: </w:t>
       </w:r>
-      <w:hyperlink r:id="rId5" w:tgtFrame="_blank" w:history="1">
+      <w:hyperlink r:id="rId6" w:tgtFrame="_blank" w:history="1">
         <w:r>
           <w:rPr>
             <w:rStyle w:val="Hyperlink"/>
@@ -111,7 +119,7 @@
         </w:rPr>
         <w:t xml:space="preserve">, </w:t>
       </w:r>
-      <w:hyperlink r:id="rId6" w:tgtFrame="_blank" w:history="1">
+      <w:hyperlink r:id="rId7" w:tgtFrame="_blank" w:history="1">
         <w:r>
           <w:rPr>
             <w:rStyle w:val="Hyperlink"/>
@@ -144,6 +152,15 @@
           <w:sz w:val="28"/>
           <w:szCs w:val="28"/>
         </w:rPr>
+        <w:t xml:space="preserve">                                                 </w:t>
+      </w:r>
+      <w:r>
+        <w:rPr>
+          <w:b/>
+          <w:bCs/>
+          <w:sz w:val="28"/>
+          <w:szCs w:val="28"/>
+        </w:rPr>
         <w:t>EMPLOYMENT AGREEMENT</w:t>
       </w:r>
       <w:r>
@@ -182,64 +199,17 @@
         <w:rPr>
           <w:b/>
         </w:rPr>
-        <w:t>EMPLOYEE NAME</w:t>
-      </w:r>
+        <w:t>Mr./Ms. NAME</w:t>
+      </w:r>
+      <w:proofErr w:type="spellEnd"/>
       <w:r>
         <w:t xml:space="preserve">, residing at </w:t>
       </w:r>
-      <w:proofErr w:type="spellStart"/>
       <w:r>
         <w:rPr>
           <w:b/>
         </w:rPr>
         <w:t>ADDRESS</w:t>
-      </w:r>
-      <w:proofErr w:type="spellEnd"/>
-      <w:r>
-        <w:rPr>
-          <w:b/>
-        </w:rPr>
-      </w:r>
-      <w:proofErr w:type="spellStart"/>
-      <w:r>
-        <w:rPr>
-          <w:b/>
-        </w:rPr>
-      </w:r>
-      <w:proofErr w:type="spellEnd"/>
-      <w:r>
-        <w:rPr>
-          <w:b/>
-        </w:rPr>
-      </w:r>
-      <w:proofErr w:type="spellStart"/>
-      <w:r>
-        <w:rPr>
-          <w:b/>
-        </w:rPr>
-      </w:r>
-      <w:proofErr w:type="spellEnd"/>
-      <w:r>
-        <w:rPr>
-          <w:b/>
-        </w:rPr>
-      </w:r>
-      <w:r>
-        <w:rPr>
-          <w:b/>
-        </w:rPr>
-      </w:r>
-      <w:proofErr w:type="spellStart"/>
-      <w:r>
-        <w:rPr>
-          <w:b/>
-        </w:rPr>
-      </w:r>
-      <w:proofErr w:type="spellEnd"/>
-      <w:r>
-        <w:rPr>
-          <w:b/>
-        </w:rPr>
       </w:r>
       <w:r>
         <w:t xml:space="preserve"> </w:t>
@@ -387,7 +357,7 @@
         <w:rPr>
           <w:b/>
         </w:rPr>
-        <w:t>₹54,167</w:t>
+        <w:t>MONTHLY CTC</w:t>
       </w:r>
       <w:r>
         <w:t xml:space="preserve"> (Indian Rupees </w:t>
@@ -396,7 +366,7 @@
         <w:rPr>
           <w:b/>
         </w:rPr>
-        <w:t>Fifty Four Thousand One Hundred Sixty Seven Rupees Only</w:t>
+        <w:t>MONTHLY CTC IN WORDS</w:t>
       </w:r>
       <w:r>
         <w:t xml:space="preserve"> only), subject to applicable deductions. The Company may, at its sole and absolute discretion, grant a performance-based bonus, which shall be contingent upon the performance of the Company and the Employee. Any bonus paid shall be discretionary, shall not form part of the Employee’s salary, and shall not constitute any precedent or create an entitlement in any subsequent year.</w:t>
@@ -404,27 +374,28 @@
     </w:p>
     <w:tbl>
       <w:tblPr>
-        <w:tblW w:w="10226" w:type="dxa"/>
+        <w:tblW w:w="8678" w:type="dxa"/>
+        <w:tblInd w:w="1548" w:type="dxa"/>
         <w:tblCellMar>
           <w:top w:w="15" w:type="dxa"/>
         </w:tblCellMar>
         <w:tblLook w:val="04A0" w:firstRow="1" w:lastRow="0" w:firstColumn="1" w:lastColumn="0" w:noHBand="0" w:noVBand="1"/>
       </w:tblPr>
       <w:tblGrid>
-        <w:gridCol w:w="5490"/>
-        <w:gridCol w:w="2250"/>
-        <w:gridCol w:w="2250"/>
-        <w:gridCol w:w="236"/>
+        <w:gridCol w:w="3060"/>
+        <w:gridCol w:w="1440"/>
+        <w:gridCol w:w="1620"/>
+        <w:gridCol w:w="2558"/>
       </w:tblGrid>
       <w:tr>
         <w:trPr>
           <w:gridAfter w:val="1"/>
-          <w:wAfter w:w="236" w:type="dxa"/>
+          <w:wAfter w:w="2558" w:type="dxa"/>
           <w:trHeight w:val="290"/>
         </w:trPr>
         <w:tc>
           <w:tcPr>
-            <w:tcW w:w="9990" w:type="dxa"/>
+            <w:tcW w:w="6120" w:type="dxa"/>
             <w:gridSpan w:val="3"/>
             <w:tcBorders>
               <w:top w:val="nil"/>
@@ -472,12 +443,12 @@
       <w:tr>
         <w:trPr>
           <w:gridAfter w:val="1"/>
-          <w:wAfter w:w="236" w:type="dxa"/>
+          <w:wAfter w:w="2558" w:type="dxa"/>
           <w:trHeight w:val="300"/>
         </w:trPr>
         <w:tc>
           <w:tcPr>
-            <w:tcW w:w="5490" w:type="dxa"/>
+            <w:tcW w:w="3060" w:type="dxa"/>
             <w:tcBorders>
               <w:top w:val="nil"/>
               <w:left w:val="nil"/>
@@ -503,7 +474,7 @@
         </w:tc>
         <w:tc>
           <w:tcPr>
-            <w:tcW w:w="2250" w:type="dxa"/>
+            <w:tcW w:w="1440" w:type="dxa"/>
             <w:tcBorders>
               <w:top w:val="nil"/>
               <w:left w:val="nil"/>
@@ -528,7 +499,7 @@
         </w:tc>
         <w:tc>
           <w:tcPr>
-            <w:tcW w:w="2250" w:type="dxa"/>
+            <w:tcW w:w="1620" w:type="dxa"/>
             <w:tcBorders>
               <w:top w:val="nil"/>
               <w:left w:val="nil"/>
@@ -555,12 +526,12 @@
       <w:tr>
         <w:trPr>
           <w:gridAfter w:val="1"/>
-          <w:wAfter w:w="236" w:type="dxa"/>
+          <w:wAfter w:w="2558" w:type="dxa"/>
           <w:trHeight w:val="300"/>
         </w:trPr>
         <w:tc>
           <w:tcPr>
-            <w:tcW w:w="5490" w:type="dxa"/>
+            <w:tcW w:w="3060" w:type="dxa"/>
             <w:tcBorders>
               <w:top w:val="single" w:sz="8" w:space="0" w:color="auto"/>
               <w:left w:val="single" w:sz="8" w:space="0" w:color="auto"/>
@@ -595,7 +566,7 @@
         </w:tc>
         <w:tc>
           <w:tcPr>
-            <w:tcW w:w="2250" w:type="dxa"/>
+            <w:tcW w:w="1440" w:type="dxa"/>
             <w:tcBorders>
               <w:top w:val="single" w:sz="8" w:space="0" w:color="auto"/>
               <w:left w:val="single" w:sz="8" w:space="0" w:color="auto"/>
@@ -630,7 +601,7 @@
         </w:tc>
         <w:tc>
           <w:tcPr>
-            <w:tcW w:w="2250" w:type="dxa"/>
+            <w:tcW w:w="1620" w:type="dxa"/>
             <w:tcBorders>
               <w:top w:val="single" w:sz="8" w:space="0" w:color="auto"/>
               <w:left w:val="nil"/>
@@ -667,12 +638,12 @@
       <w:tr>
         <w:trPr>
           <w:gridAfter w:val="1"/>
-          <w:wAfter w:w="236" w:type="dxa"/>
+          <w:wAfter w:w="2558" w:type="dxa"/>
           <w:trHeight w:val="290"/>
         </w:trPr>
         <w:tc>
           <w:tcPr>
-            <w:tcW w:w="5490" w:type="dxa"/>
+            <w:tcW w:w="3060" w:type="dxa"/>
             <w:tcBorders>
               <w:top w:val="nil"/>
               <w:left w:val="single" w:sz="8" w:space="0" w:color="auto"/>
@@ -703,7 +674,7 @@
         </w:tc>
         <w:tc>
           <w:tcPr>
-            <w:tcW w:w="2250" w:type="dxa"/>
+            <w:tcW w:w="1440" w:type="dxa"/>
             <w:tcBorders>
               <w:top w:val="nil"/>
               <w:left w:val="single" w:sz="8" w:space="0" w:color="auto"/>
@@ -723,7 +694,7 @@
         </w:tc>
         <w:tc>
           <w:tcPr>
-            <w:tcW w:w="2250" w:type="dxa"/>
+            <w:tcW w:w="1620" w:type="dxa"/>
             <w:tcBorders>
               <w:top w:val="nil"/>
               <w:left w:val="nil"/>
@@ -745,12 +716,12 @@
       <w:tr>
         <w:trPr>
           <w:gridAfter w:val="1"/>
-          <w:wAfter w:w="236" w:type="dxa"/>
+          <w:wAfter w:w="2558" w:type="dxa"/>
           <w:trHeight w:val="290"/>
         </w:trPr>
         <w:tc>
           <w:tcPr>
-            <w:tcW w:w="5490" w:type="dxa"/>
+            <w:tcW w:w="3060" w:type="dxa"/>
             <w:tcBorders>
               <w:top w:val="nil"/>
               <w:left w:val="single" w:sz="8" w:space="0" w:color="auto"/>
@@ -781,7 +752,7 @@
         </w:tc>
         <w:tc>
           <w:tcPr>
-            <w:tcW w:w="2250" w:type="dxa"/>
+            <w:tcW w:w="1440" w:type="dxa"/>
             <w:tcBorders>
               <w:top w:val="nil"/>
               <w:left w:val="single" w:sz="8" w:space="0" w:color="auto"/>
@@ -801,7 +772,7 @@
         </w:tc>
         <w:tc>
           <w:tcPr>
-            <w:tcW w:w="2250" w:type="dxa"/>
+            <w:tcW w:w="1620" w:type="dxa"/>
             <w:tcBorders>
               <w:top w:val="nil"/>
               <w:left w:val="nil"/>
@@ -823,12 +794,12 @@
       <w:tr>
         <w:trPr>
           <w:gridAfter w:val="1"/>
-          <w:wAfter w:w="236" w:type="dxa"/>
+          <w:wAfter w:w="2558" w:type="dxa"/>
           <w:trHeight w:val="290"/>
         </w:trPr>
         <w:tc>
           <w:tcPr>
-            <w:tcW w:w="5490" w:type="dxa"/>
+            <w:tcW w:w="3060" w:type="dxa"/>
             <w:tcBorders>
               <w:top w:val="nil"/>
               <w:left w:val="single" w:sz="8" w:space="0" w:color="auto"/>
@@ -859,7 +830,7 @@
         </w:tc>
         <w:tc>
           <w:tcPr>
-            <w:tcW w:w="2250" w:type="dxa"/>
+            <w:tcW w:w="1440" w:type="dxa"/>
             <w:tcBorders>
               <w:top w:val="nil"/>
               <w:left w:val="single" w:sz="8" w:space="0" w:color="auto"/>
@@ -879,7 +850,7 @@
         </w:tc>
         <w:tc>
           <w:tcPr>
-            <w:tcW w:w="2250" w:type="dxa"/>
+            <w:tcW w:w="1620" w:type="dxa"/>
             <w:tcBorders>
               <w:top w:val="nil"/>
               <w:left w:val="nil"/>
@@ -901,12 +872,12 @@
       <w:tr>
         <w:trPr>
           <w:gridAfter w:val="1"/>
-          <w:wAfter w:w="236" w:type="dxa"/>
+          <w:wAfter w:w="2558" w:type="dxa"/>
           <w:trHeight w:val="290"/>
         </w:trPr>
         <w:tc>
           <w:tcPr>
-            <w:tcW w:w="5490" w:type="dxa"/>
+            <w:tcW w:w="3060" w:type="dxa"/>
             <w:tcBorders>
               <w:top w:val="nil"/>
               <w:left w:val="single" w:sz="8" w:space="0" w:color="auto"/>
@@ -937,7 +908,7 @@
         </w:tc>
         <w:tc>
           <w:tcPr>
-            <w:tcW w:w="2250" w:type="dxa"/>
+            <w:tcW w:w="1440" w:type="dxa"/>
             <w:tcBorders>
               <w:top w:val="nil"/>
               <w:left w:val="single" w:sz="8" w:space="0" w:color="auto"/>
@@ -957,7 +928,7 @@
         </w:tc>
         <w:tc>
           <w:tcPr>
-            <w:tcW w:w="2250" w:type="dxa"/>
+            <w:tcW w:w="1620" w:type="dxa"/>
             <w:tcBorders>
               <w:top w:val="nil"/>
               <w:left w:val="nil"/>
@@ -979,12 +950,12 @@
       <w:tr>
         <w:trPr>
           <w:gridAfter w:val="1"/>
-          <w:wAfter w:w="236" w:type="dxa"/>
+          <w:wAfter w:w="2558" w:type="dxa"/>
           <w:trHeight w:val="300"/>
         </w:trPr>
         <w:tc>
           <w:tcPr>
-            <w:tcW w:w="5490" w:type="dxa"/>
+            <w:tcW w:w="3060" w:type="dxa"/>
             <w:tcBorders>
               <w:top w:val="nil"/>
               <w:left w:val="single" w:sz="8" w:space="0" w:color="auto"/>
@@ -1015,7 +986,7 @@
         </w:tc>
         <w:tc>
           <w:tcPr>
-            <w:tcW w:w="2250" w:type="dxa"/>
+            <w:tcW w:w="1440" w:type="dxa"/>
             <w:tcBorders>
               <w:top w:val="nil"/>
               <w:left w:val="single" w:sz="8" w:space="0" w:color="auto"/>
@@ -1035,7 +1006,7 @@
         </w:tc>
         <w:tc>
           <w:tcPr>
-            <w:tcW w:w="2250" w:type="dxa"/>
+            <w:tcW w:w="1620" w:type="dxa"/>
             <w:tcBorders>
               <w:top w:val="nil"/>
               <w:left w:val="nil"/>
@@ -1057,12 +1028,12 @@
       <w:tr>
         <w:trPr>
           <w:gridAfter w:val="1"/>
-          <w:wAfter w:w="236" w:type="dxa"/>
+          <w:wAfter w:w="2558" w:type="dxa"/>
           <w:trHeight w:val="290"/>
         </w:trPr>
         <w:tc>
           <w:tcPr>
-            <w:tcW w:w="5490" w:type="dxa"/>
+            <w:tcW w:w="3060" w:type="dxa"/>
             <w:tcBorders>
               <w:top w:val="nil"/>
               <w:left w:val="single" w:sz="8" w:space="0" w:color="auto"/>
@@ -1093,7 +1064,7 @@
         </w:tc>
         <w:tc>
           <w:tcPr>
-            <w:tcW w:w="2250" w:type="dxa"/>
+            <w:tcW w:w="1440" w:type="dxa"/>
             <w:tcBorders>
               <w:top w:val="nil"/>
               <w:left w:val="single" w:sz="8" w:space="0" w:color="auto"/>
@@ -1113,7 +1084,7 @@
         </w:tc>
         <w:tc>
           <w:tcPr>
-            <w:tcW w:w="2250" w:type="dxa"/>
+            <w:tcW w:w="1620" w:type="dxa"/>
             <w:tcBorders>
               <w:top w:val="nil"/>
               <w:left w:val="nil"/>
@@ -1135,12 +1106,12 @@
       <w:tr>
         <w:trPr>
           <w:gridAfter w:val="1"/>
-          <w:wAfter w:w="236" w:type="dxa"/>
+          <w:wAfter w:w="2558" w:type="dxa"/>
           <w:trHeight w:val="290"/>
         </w:trPr>
         <w:tc>
           <w:tcPr>
-            <w:tcW w:w="5490" w:type="dxa"/>
+            <w:tcW w:w="3060" w:type="dxa"/>
             <w:tcBorders>
               <w:top w:val="nil"/>
               <w:left w:val="single" w:sz="8" w:space="0" w:color="auto"/>
@@ -1177,7 +1148,7 @@
         </w:tc>
         <w:tc>
           <w:tcPr>
-            <w:tcW w:w="2250" w:type="dxa"/>
+            <w:tcW w:w="1440" w:type="dxa"/>
             <w:tcBorders>
               <w:top w:val="nil"/>
               <w:left w:val="single" w:sz="8" w:space="0" w:color="auto"/>
@@ -1201,7 +1172,7 @@
         </w:tc>
         <w:tc>
           <w:tcPr>
-            <w:tcW w:w="2250" w:type="dxa"/>
+            <w:tcW w:w="1620" w:type="dxa"/>
             <w:tcBorders>
               <w:top w:val="nil"/>
               <w:left w:val="nil"/>
@@ -1227,12 +1198,12 @@
       <w:tr>
         <w:trPr>
           <w:gridAfter w:val="1"/>
-          <w:wAfter w:w="236" w:type="dxa"/>
+          <w:wAfter w:w="2558" w:type="dxa"/>
           <w:trHeight w:val="290"/>
         </w:trPr>
         <w:tc>
           <w:tcPr>
-            <w:tcW w:w="5490" w:type="dxa"/>
+            <w:tcW w:w="3060" w:type="dxa"/>
             <w:tcBorders>
               <w:top w:val="nil"/>
               <w:left w:val="single" w:sz="8" w:space="0" w:color="auto"/>
@@ -1263,7 +1234,7 @@
         </w:tc>
         <w:tc>
           <w:tcPr>
-            <w:tcW w:w="2250" w:type="dxa"/>
+            <w:tcW w:w="1440" w:type="dxa"/>
             <w:tcBorders>
               <w:top w:val="nil"/>
               <w:left w:val="single" w:sz="8" w:space="0" w:color="auto"/>
@@ -1283,7 +1254,7 @@
         </w:tc>
         <w:tc>
           <w:tcPr>
-            <w:tcW w:w="2250" w:type="dxa"/>
+            <w:tcW w:w="1620" w:type="dxa"/>
             <w:tcBorders>
               <w:top w:val="nil"/>
               <w:left w:val="nil"/>
@@ -1305,12 +1276,12 @@
       <w:tr>
         <w:trPr>
           <w:gridAfter w:val="1"/>
-          <w:wAfter w:w="236" w:type="dxa"/>
+          <w:wAfter w:w="2558" w:type="dxa"/>
           <w:trHeight w:val="290"/>
         </w:trPr>
         <w:tc>
           <w:tcPr>
-            <w:tcW w:w="5490" w:type="dxa"/>
+            <w:tcW w:w="3060" w:type="dxa"/>
             <w:tcBorders>
               <w:top w:val="nil"/>
               <w:left w:val="single" w:sz="8" w:space="0" w:color="auto"/>
@@ -1341,7 +1312,7 @@
         </w:tc>
         <w:tc>
           <w:tcPr>
-            <w:tcW w:w="2250" w:type="dxa"/>
+            <w:tcW w:w="1440" w:type="dxa"/>
             <w:tcBorders>
               <w:top w:val="nil"/>
               <w:left w:val="single" w:sz="8" w:space="0" w:color="auto"/>
@@ -1361,7 +1332,7 @@
         </w:tc>
         <w:tc>
           <w:tcPr>
-            <w:tcW w:w="2250" w:type="dxa"/>
+            <w:tcW w:w="1620" w:type="dxa"/>
             <w:tcBorders>
               <w:top w:val="nil"/>
               <w:left w:val="nil"/>
@@ -1383,12 +1354,12 @@
       <w:tr>
         <w:trPr>
           <w:gridAfter w:val="1"/>
-          <w:wAfter w:w="236" w:type="dxa"/>
+          <w:wAfter w:w="2558" w:type="dxa"/>
           <w:trHeight w:val="300"/>
         </w:trPr>
         <w:tc>
           <w:tcPr>
-            <w:tcW w:w="5490" w:type="dxa"/>
+            <w:tcW w:w="3060" w:type="dxa"/>
             <w:tcBorders>
               <w:top w:val="nil"/>
               <w:left w:val="single" w:sz="8" w:space="0" w:color="auto"/>
@@ -1423,7 +1394,7 @@
         </w:tc>
         <w:tc>
           <w:tcPr>
-            <w:tcW w:w="2250" w:type="dxa"/>
+            <w:tcW w:w="1440" w:type="dxa"/>
             <w:tcBorders>
               <w:top w:val="nil"/>
               <w:left w:val="single" w:sz="8" w:space="0" w:color="auto"/>
@@ -1443,7 +1414,7 @@
         </w:tc>
         <w:tc>
           <w:tcPr>
-            <w:tcW w:w="2250" w:type="dxa"/>
+            <w:tcW w:w="1620" w:type="dxa"/>
             <w:tcBorders>
               <w:top w:val="nil"/>
               <w:left w:val="nil"/>
@@ -1465,12 +1436,12 @@
       <w:tr>
         <w:trPr>
           <w:gridAfter w:val="1"/>
-          <w:wAfter w:w="236" w:type="dxa"/>
+          <w:wAfter w:w="2558" w:type="dxa"/>
           <w:trHeight w:val="450"/>
         </w:trPr>
         <w:tc>
           <w:tcPr>
-            <w:tcW w:w="9990" w:type="dxa"/>
+            <w:tcW w:w="6120" w:type="dxa"/>
             <w:gridSpan w:val="3"/>
             <w:vMerge w:val="restart"/>
             <w:tcBorders>
@@ -1507,7 +1478,7 @@
         </w:trPr>
         <w:tc>
           <w:tcPr>
-            <w:tcW w:w="9990" w:type="dxa"/>
+            <w:tcW w:w="6120" w:type="dxa"/>
             <w:gridSpan w:val="3"/>
             <w:vMerge/>
             <w:tcBorders>
@@ -1531,7 +1502,7 @@
         </w:tc>
         <w:tc>
           <w:tcPr>
-            <w:tcW w:w="236" w:type="dxa"/>
+            <w:tcW w:w="2558" w:type="dxa"/>
             <w:tcBorders>
               <w:top w:val="nil"/>
               <w:left w:val="nil"/>
@@ -1813,22 +1784,8 @@
                             </w:r>
                             <w:r>
                               <w:br/>
-                              <w:t xml:space="preserve">Name: </w:t>
+                              <w:t xml:space="preserve">Name: EMPLOYEE NAME</w:t>
                             </w:r>
-                            <w:r>
-                              <w:rPr>
-                                <w:b/>
-                              </w:rPr>
-                              <w:t xml:space="preserve">Parthasarathi </w:t>
-                            </w:r>
-                            <w:proofErr w:type="spellStart"/>
-                            <w:r>
-                              <w:rPr>
-                                <w:b/>
-                              </w:rPr>
-                              <w:t>Behura</w:t>
-                            </w:r>
-                            <w:proofErr w:type="spellEnd"/>
                             <w:r>
                               <w:br/>
                             </w:r>
@@ -1853,11 +1810,11 @@
           </mc:Choice>
           <mc:Fallback>
             <w:pict>
-              <v:shapetype w14:anchorId="22DDD827" id="_x0000_t202" coordsize="21600,21600" o:spt="202" path="m,l,21600r21600,l21600,xe">
+              <v:shapetype id="_x0000_t202" coordsize="21600,21600" o:spt="202" path="m,l,21600r21600,l21600,xe">
                 <v:stroke joinstyle="miter"/>
                 <v:path gradientshapeok="t" o:connecttype="rect"/>
               </v:shapetype>
-              <v:shape id="Text Box 2" o:spid="_x0000_s1026" type="#_x0000_t202" style="position:absolute;left:0;text-align:left;margin-left:284.2pt;margin-top:150.4pt;width:185.9pt;height:110.6pt;z-index:251659264;visibility:visible;mso-wrap-style:square;mso-width-percent:400;mso-height-percent:200;mso-wrap-distance-left:9pt;mso-wrap-distance-top:3.6pt;mso-wrap-distance-right:9pt;mso-wrap-distance-bottom:3.6pt;mso-position-horizontal:absolute;mso-position-horizontal-relative:text;mso-position-vertical:absolute;mso-position-vertical-relative:text;mso-width-percent:400;mso-height-percent:200;mso-width-relative:margin;mso-height-relative:margin;v-text-anchor:top" o:gfxdata="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" stroked="f">
+              <v:shape id="Text Box 2" o:spid="_x0000_s1026" type="#_x0000_t202" style="position:absolute;left:0;text-align:left;margin-left:284.2pt;margin-top:150.4pt;width:185.9pt;height:110.6pt;z-index:251659264;visibility:visible;mso-wrap-style:square;mso-width-percent:400;mso-height-percent:200;mso-wrap-distance-left:9pt;mso-wrap-distance-top:3.6pt;mso-wrap-distance-right:9pt;mso-wrap-distance-bottom:3.6pt;mso-position-horizontal:absolute;mso-position-horizontal-relative:text;mso-position-vertical:absolute;mso-position-vertical-relative:text;mso-width-percent:400;mso-height-percent:200;mso-width-relative:margin;mso-height-relative:margin;v-text-anchor:top" o:gfxdata="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" stroked="f">
                 <v:textbox style="mso-fit-shape-to-text:t">
                   <w:txbxContent>
                     <w:p>
@@ -1888,22 +1845,8 @@
                       </w:r>
                       <w:r>
                         <w:br/>
-                        <w:t xml:space="preserve">Name: </w:t>
+                        <w:t xml:space="preserve">Name: EMPLOYEE NAME</w:t>
                       </w:r>
-                      <w:r>
-                        <w:rPr>
-                          <w:b/>
-                        </w:rPr>
-                        <w:t xml:space="preserve">Parthasarathi </w:t>
-                      </w:r>
-                      <w:proofErr w:type="spellStart"/>
-                      <w:r>
-                        <w:rPr>
-                          <w:b/>
-                        </w:rPr>
-                        <w:t>Behura</w:t>
-                      </w:r>
-                      <w:proofErr w:type="spellEnd"/>
                       <w:r>
                         <w:br/>
                       </w:r>
@@ -1969,7 +1912,7 @@
       </w:r>
       <w:r>
         <w:br/>
-        <w:t xml:space="preserve">Name: </w:t>
+        <w:t xml:space="preserve">Name: EMPLOYEE NAME</w:t>
       </w:r>
       <w:r>
         <w:t>Tanmay Jain</w:t>
@@ -1994,7 +1937,10 @@
     <w:p/>
     <w:bookmarkEnd w:id="1"/>
     <w:p/>
-    <w:p/>
+    <w:p>
+      <w:bookmarkStart w:id="4" w:name="_GoBack"/>
+      <w:bookmarkEnd w:id="4"/>
+    </w:p>
     <w:sectPr>
       <w:pgSz w:w="12240" w:h="15840"/>
       <w:pgMar w:top="1440" w:right="1080" w:bottom="1440" w:left="1080" w:header="720" w:footer="720" w:gutter="0"/>
@@ -2006,8 +1952,8 @@
 </file>
 
 <file path=word/numbering.xml><?xml version="1.0" encoding="utf-8"?>
-<w:numbering xmlns:wpc="http://schemas.microsoft.com/office/word/2010/wordprocessingCanvas" xmlns:cx="http://schemas.microsoft.com/office/drawing/2014/chartex" xmlns:cx1="http://schemas.microsoft.com/office/drawing/2015/9/8/chartex" xmlns:cx2="http://schemas.microsoft.com/office/drawing/2015/10/21/chartex" xmlns:cx3="http://schemas.microsoft.com/office/drawing/2016/5/9/chartex" xmlns:cx4="http://schemas.microsoft.com/office/drawing/2016/5/10/chartex" xmlns:cx5="http://schemas.microsoft.com/office/drawing/2016/5/11/chartex" xmlns:cx6="http://schemas.microsoft.com/office/drawing/2016/5/12/chartex" xmlns:cx7="http://schemas.microsoft.com/office/drawing/2016/5/13/chartex" xmlns:cx8="http://schemas.microsoft.com/office/drawing/2016/5/14/chartex" xmlns:mc="http://schemas.openxmlformats.org/markup-compatibility/2006" xmlns:aink="http://schemas.microsoft.com/office/drawing/2016/ink" xmlns:am3d="http://schemas.microsoft.com/office/drawing/2017/model3d" xmlns:o="urn:schemas-microsoft-com:office:office" xmlns:r="http://schemas.openxmlformats.org/officeDocument/2006/relationships" xmlns:m="http://schemas.openxmlformats.org/officeDocument/2006/math" xmlns:v="urn:schemas-microsoft-com:vml" xmlns:wp14="http://schemas.microsoft.com/office/word/2010/wordprocessingDrawing" xmlns:wp="http://schemas.openxmlformats.org/drawingml/2006/wordprocessingDrawing" xmlns:w10="urn:schemas-microsoft-com:office:word" xmlns:w="http://schemas.openxmlformats.org/wordprocessingml/2006/main" xmlns:w14="http://schemas.microsoft.com/office/word/2010/wordml" xmlns:w15="http://schemas.microsoft.com/office/word/2012/wordml" xmlns:w16cex="http://schemas.microsoft.com/office/word/2018/wordml/cex" xmlns:w16cid="http://schemas.microsoft.com/office/word/2016/wordml/cid" xmlns:w16="http://schemas.microsoft.com/office/word/2018/wordml" xmlns:w16sdtdh="http://schemas.microsoft.com/office/word/2020/wordml/sdtdatahash" xmlns:w16se="http://schemas.microsoft.com/office/word/2015/wordml/symex" xmlns:wpg="http://schemas.microsoft.com/office/word/2010/wordprocessingGroup" xmlns:wpi="http://schemas.microsoft.com/office/word/2010/wordprocessingInk" xmlns:wne="http://schemas.microsoft.com/office/word/2006/wordml" xmlns:wps="http://schemas.microsoft.com/office/word/2010/wordprocessingShape" mc:Ignorable="w14 w15 w16se w16cid w16 w16cex w16sdtdh wp14">
-  <w:abstractNum w:abstractNumId="0" w15:restartNumberingAfterBreak="0">
+<w:numbering xmlns:wpc="http://schemas.microsoft.com/office/word/2010/wordprocessingCanvas" xmlns:mc="http://schemas.openxmlformats.org/markup-compatibility/2006" xmlns:o="urn:schemas-microsoft-com:office:office" xmlns:r="http://schemas.openxmlformats.org/officeDocument/2006/relationships" xmlns:m="http://schemas.openxmlformats.org/officeDocument/2006/math" xmlns:v="urn:schemas-microsoft-com:vml" xmlns:wp14="http://schemas.microsoft.com/office/word/2010/wordprocessingDrawing" xmlns:wp="http://schemas.openxmlformats.org/drawingml/2006/wordprocessingDrawing" xmlns:w10="urn:schemas-microsoft-com:office:word" xmlns:w="http://schemas.openxmlformats.org/wordprocessingml/2006/main" xmlns:w14="http://schemas.microsoft.com/office/word/2010/wordml" xmlns:wpg="http://schemas.microsoft.com/office/word/2010/wordprocessingGroup" xmlns:wpi="http://schemas.microsoft.com/office/word/2010/wordprocessingInk" xmlns:wne="http://schemas.microsoft.com/office/word/2006/wordml" xmlns:wps="http://schemas.microsoft.com/office/word/2010/wordprocessingShape" mc:Ignorable="w14 wp14">
+  <w:abstractNum w:abstractNumId="0">
     <w:nsid w:val="40221987"/>
     <w:multiLevelType w:val="hybridMultilevel"/>
     <w:tmpl w:val="76FE6EF2"/>
@@ -2103,7 +2049,7 @@
 </file>
 
 <file path=word/styles.xml><?xml version="1.0" encoding="utf-8"?>
-<w:styles xmlns:mc="http://schemas.openxmlformats.org/markup-compatibility/2006" xmlns:r="http://schemas.openxmlformats.org/officeDocument/2006/relationships" xmlns:w="http://schemas.openxmlformats.org/wordprocessingml/2006/main" xmlns:w14="http://schemas.microsoft.com/office/word/2010/wordml" xmlns:w15="http://schemas.microsoft.com/office/word/2012/wordml" xmlns:w16cex="http://schemas.microsoft.com/office/word/2018/wordml/cex" xmlns:w16cid="http://schemas.microsoft.com/office/word/2016/wordml/cid" xmlns:w16="http://schemas.microsoft.com/office/word/2018/wordml" xmlns:w16sdtdh="http://schemas.microsoft.com/office/word/2020/wordml/sdtdatahash" xmlns:w16se="http://schemas.microsoft.com/office/word/2015/wordml/symex" mc:Ignorable="w14 w15 w16se w16cid w16 w16cex w16sdtdh">
+<w:styles xmlns:mc="http://schemas.openxmlformats.org/markup-compatibility/2006" xmlns:r="http://schemas.openxmlformats.org/officeDocument/2006/relationships" xmlns:w="http://schemas.openxmlformats.org/wordprocessingml/2006/main" xmlns:w14="http://schemas.microsoft.com/office/word/2010/wordml" mc:Ignorable="w14">
   <w:docDefaults>
     <w:rPrDefault>
       <w:rPr>
@@ -2119,383 +2065,376 @@
       </w:pPr>
     </w:pPrDefault>
   </w:docDefaults>
-  <w:latentStyles w:defLockedState="0" w:defUIPriority="99" w:defSemiHidden="0" w:defUnhideWhenUsed="0" w:defQFormat="0" w:count="376">
-    <w:lsdException w:name="Normal" w:uiPriority="0" w:qFormat="1"/>
-    <w:lsdException w:name="heading 1" w:uiPriority="9" w:qFormat="1"/>
-    <w:lsdException w:name="heading 2" w:semiHidden="1" w:uiPriority="9" w:unhideWhenUsed="1" w:qFormat="1"/>
-    <w:lsdException w:name="heading 3" w:semiHidden="1" w:uiPriority="9" w:unhideWhenUsed="1" w:qFormat="1"/>
-    <w:lsdException w:name="heading 4" w:semiHidden="1" w:uiPriority="9" w:unhideWhenUsed="1" w:qFormat="1"/>
-    <w:lsdException w:name="heading 5" w:semiHidden="1" w:uiPriority="9" w:unhideWhenUsed="1" w:qFormat="1"/>
-    <w:lsdException w:name="heading 6" w:semiHidden="1" w:uiPriority="9" w:unhideWhenUsed="1" w:qFormat="1"/>
-    <w:lsdException w:name="heading 7" w:semiHidden="1" w:uiPriority="9" w:unhideWhenUsed="1" w:qFormat="1"/>
-    <w:lsdException w:name="heading 8" w:semiHidden="1" w:uiPriority="9" w:unhideWhenUsed="1" w:qFormat="1"/>
-    <w:lsdException w:name="heading 9" w:semiHidden="1" w:uiPriority="9" w:unhideWhenUsed="1" w:qFormat="1"/>
-    <w:lsdException w:name="index 1" w:semiHidden="1" w:unhideWhenUsed="1"/>
-    <w:lsdException w:name="index 2" w:semiHidden="1" w:unhideWhenUsed="1"/>
-    <w:lsdException w:name="index 3" w:semiHidden="1" w:unhideWhenUsed="1"/>
-    <w:lsdException w:name="index 4" w:semiHidden="1" w:unhideWhenUsed="1"/>
-    <w:lsdException w:name="index 5" w:semiHidden="1" w:unhideWhenUsed="1"/>
-    <w:lsdException w:name="index 6" w:semiHidden="1" w:unhideWhenUsed="1"/>
-    <w:lsdException w:name="index 7" w:semiHidden="1" w:unhideWhenUsed="1"/>
-    <w:lsdException w:name="index 8" w:semiHidden="1" w:unhideWhenUsed="1"/>
-    <w:lsdException w:name="index 9" w:semiHidden="1" w:unhideWhenUsed="1"/>
-    <w:lsdException w:name="toc 1" w:semiHidden="1" w:uiPriority="39" w:unhideWhenUsed="1"/>
-    <w:lsdException w:name="toc 2" w:semiHidden="1" w:uiPriority="39" w:unhideWhenUsed="1"/>
-    <w:lsdException w:name="toc 3" w:semiHidden="1" w:uiPriority="39" w:unhideWhenUsed="1"/>
-    <w:lsdException w:name="toc 4" w:semiHidden="1" w:uiPriority="39" w:unhideWhenUsed="1"/>
-    <w:lsdException w:name="toc 5" w:semiHidden="1" w:uiPriority="39" w:unhideWhenUsed="1"/>
-    <w:lsdException w:name="toc 6" w:semiHidden="1" w:uiPriority="39" w:unhideWhenUsed="1"/>
-    <w:lsdException w:name="toc 7" w:semiHidden="1" w:uiPriority="39" w:unhideWhenUsed="1"/>
-    <w:lsdException w:name="toc 8" w:semiHidden="1" w:uiPriority="39" w:unhideWhenUsed="1"/>
-    <w:lsdException w:name="toc 9" w:semiHidden="1" w:uiPriority="39" w:unhideWhenUsed="1"/>
-    <w:lsdException w:name="Normal Indent" w:semiHidden="1" w:unhideWhenUsed="1"/>
-    <w:lsdException w:name="footnote text" w:semiHidden="1" w:unhideWhenUsed="1"/>
-    <w:lsdException w:name="annotation text" w:semiHidden="1" w:unhideWhenUsed="1"/>
-    <w:lsdException w:name="header" w:semiHidden="1" w:unhideWhenUsed="1"/>
-    <w:lsdException w:name="footer" w:semiHidden="1" w:unhideWhenUsed="1"/>
-    <w:lsdException w:name="index heading" w:semiHidden="1" w:unhideWhenUsed="1"/>
-    <w:lsdException w:name="caption" w:semiHidden="1" w:uiPriority="35" w:unhideWhenUsed="1" w:qFormat="1"/>
-    <w:lsdException w:name="table of figures" w:semiHidden="1" w:unhideWhenUsed="1"/>
-    <w:lsdException w:name="envelope address" w:semiHidden="1" w:unhideWhenUsed="1"/>
-    <w:lsdException w:name="envelope return" w:semiHidden="1" w:unhideWhenUsed="1"/>
-    <w:lsdException w:name="footnote reference" w:semiHidden="1" w:unhideWhenUsed="1"/>
-    <w:lsdException w:name="annotation reference" w:semiHidden="1" w:unhideWhenUsed="1"/>
-    <w:lsdException w:name="line number" w:semiHidden="1" w:unhideWhenUsed="1"/>
-    <w:lsdException w:name="page number" w:semiHidden="1" w:unhideWhenUsed="1"/>
-    <w:lsdException w:name="endnote reference" w:semiHidden="1" w:unhideWhenUsed="1"/>
-    <w:lsdException w:name="endnote text" w:semiHidden="1" w:unhideWhenUsed="1"/>
-    <w:lsdException w:name="table of authorities" w:semiHidden="1" w:unhideWhenUsed="1"/>
-    <w:lsdException w:name="macro" w:semiHidden="1" w:unhideWhenUsed="1"/>
-    <w:lsdException w:name="toa heading" w:semiHidden="1" w:unhideWhenUsed="1"/>
-    <w:lsdException w:name="List" w:semiHidden="1" w:unhideWhenUsed="1"/>
-    <w:lsdException w:name="List Bullet" w:semiHidden="1" w:unhideWhenUsed="1"/>
-    <w:lsdException w:name="List Number" w:semiHidden="1" w:unhideWhenUsed="1"/>
-    <w:lsdException w:name="List 2" w:semiHidden="1" w:unhideWhenUsed="1"/>
-    <w:lsdException w:name="List 3" w:semiHidden="1" w:unhideWhenUsed="1"/>
-    <w:lsdException w:name="List 4" w:semiHidden="1" w:unhideWhenUsed="1"/>
-    <w:lsdException w:name="List 5" w:semiHidden="1" w:unhideWhenUsed="1"/>
-    <w:lsdException w:name="List Bullet 2" w:semiHidden="1" w:unhideWhenUsed="1"/>
-    <w:lsdException w:name="List Bullet 3" w:semiHidden="1" w:unhideWhenUsed="1"/>
-    <w:lsdException w:name="List Bullet 4" w:semiHidden="1" w:unhideWhenUsed="1"/>
-    <w:lsdException w:name="List Bullet 5" w:semiHidden="1" w:unhideWhenUsed="1"/>
-    <w:lsdException w:name="List Number 2" w:semiHidden="1" w:unhideWhenUsed="1"/>
-    <w:lsdException w:name="List Number 3" w:semiHidden="1" w:unhideWhenUsed="1"/>
-    <w:lsdException w:name="List Number 4" w:semiHidden="1" w:unhideWhenUsed="1"/>
-    <w:lsdException w:name="List Number 5" w:semiHidden="1" w:unhideWhenUsed="1"/>
-    <w:lsdException w:name="Title" w:uiPriority="10" w:qFormat="1"/>
-    <w:lsdException w:name="Closing" w:semiHidden="1" w:unhideWhenUsed="1"/>
-    <w:lsdException w:name="Signature" w:semiHidden="1" w:unhideWhenUsed="1"/>
-    <w:lsdException w:name="Default Paragraph Font" w:semiHidden="1" w:uiPriority="1" w:unhideWhenUsed="1"/>
-    <w:lsdException w:name="Body Text" w:semiHidden="1" w:unhideWhenUsed="1"/>
-    <w:lsdException w:name="Body Text Indent" w:semiHidden="1" w:unhideWhenUsed="1"/>
-    <w:lsdException w:name="List Continue" w:semiHidden="1" w:unhideWhenUsed="1"/>
-    <w:lsdException w:name="List Continue 2" w:semiHidden="1" w:unhideWhenUsed="1"/>
-    <w:lsdException w:name="List Continue 3" w:semiHidden="1" w:unhideWhenUsed="1"/>
-    <w:lsdException w:name="List Continue 4" w:semiHidden="1" w:unhideWhenUsed="1"/>
-    <w:lsdException w:name="List Continue 5" w:semiHidden="1" w:unhideWhenUsed="1"/>
-    <w:lsdException w:name="Message Header" w:semiHidden="1" w:unhideWhenUsed="1"/>
-    <w:lsdException w:name="Subtitle" w:uiPriority="11" w:qFormat="1"/>
-    <w:lsdException w:name="Salutation" w:semiHidden="1" w:unhideWhenUsed="1"/>
-    <w:lsdException w:name="Date" w:semiHidden="1" w:unhideWhenUsed="1"/>
-    <w:lsdException w:name="Body Text First Indent" w:semiHidden="1" w:unhideWhenUsed="1"/>
-    <w:lsdException w:name="Body Text First Indent 2" w:semiHidden="1" w:unhideWhenUsed="1"/>
-    <w:lsdException w:name="Note Heading" w:semiHidden="1" w:unhideWhenUsed="1"/>
-    <w:lsdException w:name="Body Text 2" w:semiHidden="1" w:unhideWhenUsed="1"/>
-    <w:lsdException w:name="Body Text 3" w:semiHidden="1" w:unhideWhenUsed="1"/>
-    <w:lsdException w:name="Body Text Indent 2" w:semiHidden="1" w:unhideWhenUsed="1"/>
-    <w:lsdException w:name="Body Text Indent 3" w:semiHidden="1" w:unhideWhenUsed="1"/>
-    <w:lsdException w:name="Block Text" w:semiHidden="1" w:unhideWhenUsed="1"/>
-    <w:lsdException w:name="Hyperlink" w:semiHidden="1" w:unhideWhenUsed="1"/>
-    <w:lsdException w:name="FollowedHyperlink" w:semiHidden="1" w:unhideWhenUsed="1"/>
-    <w:lsdException w:name="Strong" w:uiPriority="22" w:qFormat="1"/>
-    <w:lsdException w:name="Emphasis" w:uiPriority="20" w:qFormat="1"/>
-    <w:lsdException w:name="Document Map" w:semiHidden="1" w:unhideWhenUsed="1"/>
-    <w:lsdException w:name="Plain Text" w:semiHidden="1" w:unhideWhenUsed="1"/>
-    <w:lsdException w:name="E-mail Signature" w:semiHidden="1" w:unhideWhenUsed="1"/>
-    <w:lsdException w:name="HTML Top of Form" w:semiHidden="1" w:unhideWhenUsed="1"/>
-    <w:lsdException w:name="HTML Bottom of Form" w:semiHidden="1" w:unhideWhenUsed="1"/>
-    <w:lsdException w:name="Normal (Web)" w:semiHidden="1" w:unhideWhenUsed="1"/>
-    <w:lsdException w:name="HTML Acronym" w:semiHidden="1" w:unhideWhenUsed="1"/>
-    <w:lsdException w:name="HTML Address" w:semiHidden="1" w:unhideWhenUsed="1"/>
-    <w:lsdException w:name="HTML Cite" w:semiHidden="1" w:unhideWhenUsed="1"/>
-    <w:lsdException w:name="HTML Code" w:semiHidden="1" w:unhideWhenUsed="1"/>
-    <w:lsdException w:name="HTML Definition" w:semiHidden="1" w:unhideWhenUsed="1"/>
-    <w:lsdException w:name="HTML Keyboard" w:semiHidden="1" w:unhideWhenUsed="1"/>
-    <w:lsdException w:name="HTML Preformatted" w:semiHidden="1" w:unhideWhenUsed="1"/>
-    <w:lsdException w:name="HTML Sample" w:semiHidden="1" w:unhideWhenUsed="1"/>
-    <w:lsdException w:name="HTML Typewriter" w:semiHidden="1" w:unhideWhenUsed="1"/>
-    <w:lsdException w:name="HTML Variable" w:semiHidden="1" w:unhideWhenUsed="1"/>
-    <w:lsdException w:name="Normal Table" w:semiHidden="1" w:unhideWhenUsed="1"/>
-    <w:lsdException w:name="annotation subject" w:semiHidden="1" w:unhideWhenUsed="1"/>
-    <w:lsdException w:name="No List" w:semiHidden="1" w:unhideWhenUsed="1"/>
-    <w:lsdException w:name="Outline List 1" w:semiHidden="1" w:unhideWhenUsed="1"/>
-    <w:lsdException w:name="Outline List 2" w:semiHidden="1" w:unhideWhenUsed="1"/>
-    <w:lsdException w:name="Outline List 3" w:semiHidden="1" w:unhideWhenUsed="1"/>
-    <w:lsdException w:name="Table Simple 1" w:semiHidden="1" w:unhideWhenUsed="1"/>
-    <w:lsdException w:name="Table Simple 2" w:semiHidden="1" w:unhideWhenUsed="1"/>
-    <w:lsdException w:name="Table Simple 3" w:semiHidden="1" w:unhideWhenUsed="1"/>
-    <w:lsdException w:name="Table Classic 1" w:semiHidden="1" w:unhideWhenUsed="1"/>
-    <w:lsdException w:name="Table Classic 2" w:semiHidden="1" w:unhideWhenUsed="1"/>
-    <w:lsdException w:name="Table Classic 3" w:semiHidden="1" w:unhideWhenUsed="1"/>
-    <w:lsdException w:name="Table Classic 4" w:semiHidden="1" w:unhideWhenUsed="1"/>
-    <w:lsdException w:name="Table Colorful 1" w:semiHidden="1" w:unhideWhenUsed="1"/>
-    <w:lsdException w:name="Table Colorful 2" w:semiHidden="1" w:unhideWhenUsed="1"/>
-    <w:lsdException w:name="Table Colorful 3" w:semiHidden="1" w:unhideWhenUsed="1"/>
-    <w:lsdException w:name="Table Columns 1" w:semiHidden="1" w:unhideWhenUsed="1"/>
-    <w:lsdException w:name="Table Columns 2" w:semiHidden="1" w:unhideWhenUsed="1"/>
-    <w:lsdException w:name="Table Columns 3" w:semiHidden="1" w:unhideWhenUsed="1"/>
-    <w:lsdException w:name="Table Columns 4" w:semiHidden="1" w:unhideWhenUsed="1"/>
-    <w:lsdException w:name="Table Columns 5" w:semiHidden="1" w:unhideWhenUsed="1"/>
-    <w:lsdException w:name="Table Grid 1" w:semiHidden="1" w:unhideWhenUsed="1"/>
-    <w:lsdException w:name="Table Grid 2" w:semiHidden="1" w:unhideWhenUsed="1"/>
-    <w:lsdException w:name="Table Grid 3" w:semiHidden="1" w:unhideWhenUsed="1"/>
-    <w:lsdException w:name="Table Grid 4" w:semiHidden="1" w:unhideWhenUsed="1"/>
-    <w:lsdException w:name="Table Grid 5" w:semiHidden="1" w:unhideWhenUsed="1"/>
-    <w:lsdException w:name="Table Grid 6" w:semiHidden="1" w:unhideWhenUsed="1"/>
-    <w:lsdException w:name="Table Grid 7" w:semiHidden="1" w:unhideWhenUsed="1"/>
-    <w:lsdException w:name="Table Grid 8" w:semiHidden="1" w:unhideWhenUsed="1"/>
-    <w:lsdException w:name="Table List 1" w:semiHidden="1" w:unhideWhenUsed="1"/>
-    <w:lsdException w:name="Table List 2" w:semiHidden="1" w:unhideWhenUsed="1"/>
-    <w:lsdException w:name="Table List 3" w:semiHidden="1" w:unhideWhenUsed="1"/>
-    <w:lsdException w:name="Table List 4" w:semiHidden="1" w:unhideWhenUsed="1"/>
-    <w:lsdException w:name="Table List 5" w:semiHidden="1" w:unhideWhenUsed="1"/>
-    <w:lsdException w:name="Table List 6" w:semiHidden="1" w:unhideWhenUsed="1"/>
-    <w:lsdException w:name="Table List 7" w:semiHidden="1" w:unhideWhenUsed="1"/>
-    <w:lsdException w:name="Table List 8" w:semiHidden="1" w:unhideWhenUsed="1"/>
-    <w:lsdException w:name="Table 3D effects 1" w:semiHidden="1" w:unhideWhenUsed="1"/>
-    <w:lsdException w:name="Table 3D effects 2" w:semiHidden="1" w:unhideWhenUsed="1"/>
-    <w:lsdException w:name="Table 3D effects 3" w:semiHidden="1" w:unhideWhenUsed="1"/>
-    <w:lsdException w:name="Table Contemporary" w:semiHidden="1" w:unhideWhenUsed="1"/>
-    <w:lsdException w:name="Table Elegant" w:semiHidden="1" w:unhideWhenUsed="1"/>
-    <w:lsdException w:name="Table Professional" w:semiHidden="1" w:unhideWhenUsed="1"/>
-    <w:lsdException w:name="Table Subtle 1" w:semiHidden="1" w:unhideWhenUsed="1"/>
-    <w:lsdException w:name="Table Subtle 2" w:semiHidden="1" w:unhideWhenUsed="1"/>
-    <w:lsdException w:name="Table Web 1" w:semiHidden="1" w:unhideWhenUsed="1"/>
-    <w:lsdException w:name="Table Web 2" w:semiHidden="1" w:unhideWhenUsed="1"/>
-    <w:lsdException w:name="Table Web 3" w:semiHidden="1" w:unhideWhenUsed="1"/>
-    <w:lsdException w:name="Balloon Text" w:semiHidden="1" w:unhideWhenUsed="1"/>
-    <w:lsdException w:name="Table Grid" w:uiPriority="39"/>
-    <w:lsdException w:name="Table Theme" w:semiHidden="1" w:unhideWhenUsed="1"/>
-    <w:lsdException w:name="Placeholder Text" w:semiHidden="1"/>
-    <w:lsdException w:name="No Spacing" w:uiPriority="1" w:qFormat="1"/>
-    <w:lsdException w:name="Light Shading" w:uiPriority="60"/>
-    <w:lsdException w:name="Light List" w:uiPriority="61"/>
-    <w:lsdException w:name="Light Grid" w:uiPriority="62"/>
-    <w:lsdException w:name="Medium Shading 1" w:uiPriority="63"/>
-    <w:lsdException w:name="Medium Shading 2" w:uiPriority="64"/>
-    <w:lsdException w:name="Medium List 1" w:uiPriority="65"/>
-    <w:lsdException w:name="Medium List 2" w:uiPriority="66"/>
-    <w:lsdException w:name="Medium Grid 1" w:uiPriority="67"/>
-    <w:lsdException w:name="Medium Grid 2" w:uiPriority="68"/>
-    <w:lsdException w:name="Medium Grid 3" w:uiPriority="69"/>
-    <w:lsdException w:name="Dark List" w:uiPriority="70"/>
-    <w:lsdException w:name="Colorful Shading" w:uiPriority="71"/>
-    <w:lsdException w:name="Colorful List" w:uiPriority="72"/>
-    <w:lsdException w:name="Colorful Grid" w:uiPriority="73"/>
-    <w:lsdException w:name="Light Shading Accent 1" w:uiPriority="60"/>
-    <w:lsdException w:name="Light List Accent 1" w:uiPriority="61"/>
-    <w:lsdException w:name="Light Grid Accent 1" w:uiPriority="62"/>
-    <w:lsdException w:name="Medium Shading 1 Accent 1" w:uiPriority="63"/>
-    <w:lsdException w:name="Medium Shading 2 Accent 1" w:uiPriority="64"/>
-    <w:lsdException w:name="Medium List 1 Accent 1" w:uiPriority="65"/>
-    <w:lsdException w:name="Revision" w:semiHidden="1"/>
-    <w:lsdException w:name="List Paragraph" w:uiPriority="1" w:qFormat="1"/>
-    <w:lsdException w:name="Quote" w:uiPriority="29" w:qFormat="1"/>
-    <w:lsdException w:name="Intense Quote" w:uiPriority="30" w:qFormat="1"/>
-    <w:lsdException w:name="Medium List 2 Accent 1" w:uiPriority="66"/>
-    <w:lsdException w:name="Medium Grid 1 Accent 1" w:uiPriority="67"/>
-    <w:lsdException w:name="Medium Grid 2 Accent 1" w:uiPriority="68"/>
-    <w:lsdException w:name="Medium Grid 3 Accent 1" w:uiPriority="69"/>
-    <w:lsdException w:name="Dark List Accent 1" w:uiPriority="70"/>
-    <w:lsdException w:name="Colorful Shading Accent 1" w:uiPriority="71"/>
-    <w:lsdException w:name="Colorful List Accent 1" w:uiPriority="72"/>
-    <w:lsdException w:name="Colorful Grid Accent 1" w:uiPriority="73"/>
-    <w:lsdException w:name="Light Shading Accent 2" w:uiPriority="60"/>
-    <w:lsdException w:name="Light List Accent 2" w:uiPriority="61"/>
-    <w:lsdException w:name="Light Grid Accent 2" w:uiPriority="62"/>
-    <w:lsdException w:name="Medium Shading 1 Accent 2" w:uiPriority="63"/>
-    <w:lsdException w:name="Medium Shading 2 Accent 2" w:uiPriority="64"/>
-    <w:lsdException w:name="Medium List 1 Accent 2" w:uiPriority="65"/>
-    <w:lsdException w:name="Medium List 2 Accent 2" w:uiPriority="66"/>
-    <w:lsdException w:name="Medium Grid 1 Accent 2" w:uiPriority="67"/>
-    <w:lsdException w:name="Medium Grid 2 Accent 2" w:uiPriority="68"/>
-    <w:lsdException w:name="Medium Grid 3 Accent 2" w:uiPriority="69"/>
-    <w:lsdException w:name="Dark List Accent 2" w:uiPriority="70"/>
-    <w:lsdException w:name="Colorful Shading Accent 2" w:uiPriority="71"/>
-    <w:lsdException w:name="Colorful List Accent 2" w:uiPriority="72"/>
-    <w:lsdException w:name="Colorful Grid Accent 2" w:uiPriority="73"/>
-    <w:lsdException w:name="Light Shading Accent 3" w:uiPriority="60"/>
-    <w:lsdException w:name="Light List Accent 3" w:uiPriority="61"/>
-    <w:lsdException w:name="Light Grid Accent 3" w:uiPriority="62"/>
-    <w:lsdException w:name="Medium Shading 1 Accent 3" w:uiPriority="63"/>
-    <w:lsdException w:name="Medium Shading 2 Accent 3" w:uiPriority="64"/>
-    <w:lsdException w:name="Medium List 1 Accent 3" w:uiPriority="65"/>
-    <w:lsdException w:name="Medium List 2 Accent 3" w:uiPriority="66"/>
-    <w:lsdException w:name="Medium Grid 1 Accent 3" w:uiPriority="67"/>
-    <w:lsdException w:name="Medium Grid 2 Accent 3" w:uiPriority="68"/>
-    <w:lsdException w:name="Medium Grid 3 Accent 3" w:uiPriority="69"/>
-    <w:lsdException w:name="Dark List Accent 3" w:uiPriority="70"/>
-    <w:lsdException w:name="Colorful Shading Accent 3" w:uiPriority="71"/>
-    <w:lsdException w:name="Colorful List Accent 3" w:uiPriority="72"/>
-    <w:lsdException w:name="Colorful Grid Accent 3" w:uiPriority="73"/>
-    <w:lsdException w:name="Light Shading Accent 4" w:uiPriority="60"/>
-    <w:lsdException w:name="Light List Accent 4" w:uiPriority="61"/>
-    <w:lsdException w:name="Light Grid Accent 4" w:uiPriority="62"/>
-    <w:lsdException w:name="Medium Shading 1 Accent 4" w:uiPriority="63"/>
-    <w:lsdException w:name="Medium Shading 2 Accent 4" w:uiPriority="64"/>
-    <w:lsdException w:name="Medium List 1 Accent 4" w:uiPriority="65"/>
-    <w:lsdException w:name="Medium List 2 Accent 4" w:uiPriority="66"/>
-    <w:lsdException w:name="Medium Grid 1 Accent 4" w:uiPriority="67"/>
-    <w:lsdException w:name="Medium Grid 2 Accent 4" w:uiPriority="68"/>
-    <w:lsdException w:name="Medium Grid 3 Accent 4" w:uiPriority="69"/>
-    <w:lsdException w:name="Dark List Accent 4" w:uiPriority="70"/>
-    <w:lsdException w:name="Colorful Shading Accent 4" w:uiPriority="71"/>
-    <w:lsdException w:name="Colorful List Accent 4" w:uiPriority="72"/>
-    <w:lsdException w:name="Colorful Grid Accent 4" w:uiPriority="73"/>
-    <w:lsdException w:name="Light Shading Accent 5" w:uiPriority="60"/>
-    <w:lsdException w:name="Light List Accent 5" w:uiPriority="61"/>
-    <w:lsdException w:name="Light Grid Accent 5" w:uiPriority="62"/>
-    <w:lsdException w:name="Medium Shading 1 Accent 5" w:uiPriority="63"/>
-    <w:lsdException w:name="Medium Shading 2 Accent 5" w:uiPriority="64"/>
-    <w:lsdException w:name="Medium List 1 Accent 5" w:uiPriority="65"/>
-    <w:lsdException w:name="Medium List 2 Accent 5" w:uiPriority="66"/>
-    <w:lsdException w:name="Medium Grid 1 Accent 5" w:uiPriority="67"/>
-    <w:lsdException w:name="Medium Grid 2 Accent 5" w:uiPriority="68"/>
-    <w:lsdException w:name="Medium Grid 3 Accent 5" w:uiPriority="69"/>
-    <w:lsdException w:name="Dark List Accent 5" w:uiPriority="70"/>
-    <w:lsdException w:name="Colorful Shading Accent 5" w:uiPriority="71"/>
-    <w:lsdException w:name="Colorful List Accent 5" w:uiPriority="72"/>
-    <w:lsdException w:name="Colorful Grid Accent 5" w:uiPriority="73"/>
-    <w:lsdException w:name="Light Shading Accent 6" w:uiPriority="60"/>
-    <w:lsdException w:name="Light List Accent 6" w:uiPriority="61"/>
-    <w:lsdException w:name="Light Grid Accent 6" w:uiPriority="62"/>
-    <w:lsdException w:name="Medium Shading 1 Accent 6" w:uiPriority="63"/>
-    <w:lsdException w:name="Medium Shading 2 Accent 6" w:uiPriority="64"/>
-    <w:lsdException w:name="Medium List 1 Accent 6" w:uiPriority="65"/>
-    <w:lsdException w:name="Medium List 2 Accent 6" w:uiPriority="66"/>
-    <w:lsdException w:name="Medium Grid 1 Accent 6" w:uiPriority="67"/>
-    <w:lsdException w:name="Medium Grid 2 Accent 6" w:uiPriority="68"/>
-    <w:lsdException w:name="Medium Grid 3 Accent 6" w:uiPriority="69"/>
-    <w:lsdException w:name="Dark List Accent 6" w:uiPriority="70"/>
-    <w:lsdException w:name="Colorful Shading Accent 6" w:uiPriority="71"/>
-    <w:lsdException w:name="Colorful List Accent 6" w:uiPriority="72"/>
-    <w:lsdException w:name="Colorful Grid Accent 6" w:uiPriority="73"/>
-    <w:lsdException w:name="Subtle Emphasis" w:uiPriority="19" w:qFormat="1"/>
-    <w:lsdException w:name="Intense Emphasis" w:uiPriority="21" w:qFormat="1"/>
-    <w:lsdException w:name="Subtle Reference" w:uiPriority="31" w:qFormat="1"/>
-    <w:lsdException w:name="Intense Reference" w:uiPriority="32" w:qFormat="1"/>
-    <w:lsdException w:name="Book Title" w:uiPriority="33" w:qFormat="1"/>
-    <w:lsdException w:name="Bibliography" w:semiHidden="1" w:uiPriority="37" w:unhideWhenUsed="1"/>
-    <w:lsdException w:name="TOC Heading" w:semiHidden="1" w:uiPriority="39" w:unhideWhenUsed="1" w:qFormat="1"/>
-    <w:lsdException w:name="Plain Table 1" w:uiPriority="41"/>
-    <w:lsdException w:name="Plain Table 2" w:uiPriority="42"/>
-    <w:lsdException w:name="Plain Table 3" w:uiPriority="43"/>
-    <w:lsdException w:name="Plain Table 4" w:uiPriority="44"/>
-    <w:lsdException w:name="Plain Table 5" w:uiPriority="45"/>
-    <w:lsdException w:name="Grid Table Light" w:uiPriority="40"/>
-    <w:lsdException w:name="Grid Table 1 Light" w:uiPriority="46"/>
-    <w:lsdException w:name="Grid Table 2" w:uiPriority="47"/>
-    <w:lsdException w:name="Grid Table 3" w:uiPriority="48"/>
-    <w:lsdException w:name="Grid Table 4" w:uiPriority="49"/>
-    <w:lsdException w:name="Grid Table 5 Dark" w:uiPriority="50"/>
-    <w:lsdException w:name="Grid Table 6 Colorful" w:uiPriority="51"/>
-    <w:lsdException w:name="Grid Table 7 Colorful" w:uiPriority="52"/>
-    <w:lsdException w:name="Grid Table 1 Light Accent 1" w:uiPriority="46"/>
-    <w:lsdException w:name="Grid Table 2 Accent 1" w:uiPriority="47"/>
-    <w:lsdException w:name="Grid Table 3 Accent 1" w:uiPriority="48"/>
-    <w:lsdException w:name="Grid Table 4 Accent 1" w:uiPriority="49"/>
-    <w:lsdException w:name="Grid Table 5 Dark Accent 1" w:uiPriority="50"/>
-    <w:lsdException w:name="Grid Table 6 Colorful Accent 1" w:uiPriority="51"/>
-    <w:lsdException w:name="Grid Table 7 Colorful Accent 1" w:uiPriority="52"/>
-    <w:lsdException w:name="Grid Table 1 Light Accent 2" w:uiPriority="46"/>
-    <w:lsdException w:name="Grid Table 2 Accent 2" w:uiPriority="47"/>
-    <w:lsdException w:name="Grid Table 3 Accent 2" w:uiPriority="48"/>
-    <w:lsdException w:name="Grid Table 4 Accent 2" w:uiPriority="49"/>
-    <w:lsdException w:name="Grid Table 5 Dark Accent 2" w:uiPriority="50"/>
-    <w:lsdException w:name="Grid Table 6 Colorful Accent 2" w:uiPriority="51"/>
-    <w:lsdException w:name="Grid Table 7 Colorful Accent 2" w:uiPriority="52"/>
-    <w:lsdException w:name="Grid Table 1 Light Accent 3" w:uiPriority="46"/>
-    <w:lsdException w:name="Grid Table 2 Accent 3" w:uiPriority="47"/>
-    <w:lsdException w:name="Grid Table 3 Accent 3" w:uiPriority="48"/>
-    <w:lsdException w:name="Grid Table 4 Accent 3" w:uiPriority="49"/>
-    <w:lsdException w:name="Grid Table 5 Dark Accent 3" w:uiPriority="50"/>
-    <w:lsdException w:name="Grid Table 6 Colorful Accent 3" w:uiPriority="51"/>
-    <w:lsdException w:name="Grid Table 7 Colorful Accent 3" w:uiPriority="52"/>
-    <w:lsdException w:name="Grid Table 1 Light Accent 4" w:uiPriority="46"/>
-    <w:lsdException w:name="Grid Table 2 Accent 4" w:uiPriority="47"/>
-    <w:lsdException w:name="Grid Table 3 Accent 4" w:uiPriority="48"/>
-    <w:lsdException w:name="Grid Table 4 Accent 4" w:uiPriority="49"/>
-    <w:lsdException w:name="Grid Table 5 Dark Accent 4" w:uiPriority="50"/>
-    <w:lsdException w:name="Grid Table 6 Colorful Accent 4" w:uiPriority="51"/>
-    <w:lsdException w:name="Grid Table 7 Colorful Accent 4" w:uiPriority="52"/>
-    <w:lsdException w:name="Grid Table 1 Light Accent 5" w:uiPriority="46"/>
-    <w:lsdException w:name="Grid Table 2 Accent 5" w:uiPriority="47"/>
-    <w:lsdException w:name="Grid Table 3 Accent 5" w:uiPriority="48"/>
-    <w:lsdException w:name="Grid Table 4 Accent 5" w:uiPriority="49"/>
-    <w:lsdException w:name="Grid Table 5 Dark Accent 5" w:uiPriority="50"/>
-    <w:lsdException w:name="Grid Table 6 Colorful Accent 5" w:uiPriority="51"/>
-    <w:lsdException w:name="Grid Table 7 Colorful Accent 5" w:uiPriority="52"/>
-    <w:lsdException w:name="Grid Table 1 Light Accent 6" w:uiPriority="46"/>
-    <w:lsdException w:name="Grid Table 2 Accent 6" w:uiPriority="47"/>
-    <w:lsdException w:name="Grid Table 3 Accent 6" w:uiPriority="48"/>
-    <w:lsdException w:name="Grid Table 4 Accent 6" w:uiPriority="49"/>
-    <w:lsdException w:name="Grid Table 5 Dark Accent 6" w:uiPriority="50"/>
-    <w:lsdException w:name="Grid Table 6 Colorful Accent 6" w:uiPriority="51"/>
-    <w:lsdException w:name="Grid Table 7 Colorful Accent 6" w:uiPriority="52"/>
-    <w:lsdException w:name="List Table 1 Light" w:uiPriority="46"/>
-    <w:lsdException w:name="List Table 2" w:uiPriority="47"/>
-    <w:lsdException w:name="List Table 3" w:uiPriority="48"/>
-    <w:lsdException w:name="List Table 4" w:uiPriority="49"/>
-    <w:lsdException w:name="List Table 5 Dark" w:uiPriority="50"/>
-    <w:lsdException w:name="List Table 6 Colorful" w:uiPriority="51"/>
-    <w:lsdException w:name="List Table 7 Colorful" w:uiPriority="52"/>
-    <w:lsdException w:name="List Table 1 Light Accent 1" w:uiPriority="46"/>
-    <w:lsdException w:name="List Table 2 Accent 1" w:uiPriority="47"/>
-    <w:lsdException w:name="List Table 3 Accent 1" w:uiPriority="48"/>
-    <w:lsdException w:name="List Table 4 Accent 1" w:uiPriority="49"/>
-    <w:lsdException w:name="List Table 5 Dark Accent 1" w:uiPriority="50"/>
-    <w:lsdException w:name="List Table 6 Colorful Accent 1" w:uiPriority="51"/>
-    <w:lsdException w:name="List Table 7 Colorful Accent 1" w:uiPriority="52"/>
-    <w:lsdException w:name="List Table 1 Light Accent 2" w:uiPriority="46"/>
-    <w:lsdException w:name="List Table 2 Accent 2" w:uiPriority="47"/>
-    <w:lsdException w:name="List Table 3 Accent 2" w:uiPriority="48"/>
-    <w:lsdException w:name="List Table 4 Accent 2" w:uiPriority="49"/>
-    <w:lsdException w:name="List Table 5 Dark Accent 2" w:uiPriority="50"/>
-    <w:lsdException w:name="List Table 6 Colorful Accent 2" w:uiPriority="51"/>
-    <w:lsdException w:name="List Table 7 Colorful Accent 2" w:uiPriority="52"/>
-    <w:lsdException w:name="List Table 1 Light Accent 3" w:uiPriority="46"/>
-    <w:lsdException w:name="List Table 2 Accent 3" w:uiPriority="47"/>
-    <w:lsdException w:name="List Table 3 Accent 3" w:uiPriority="48"/>
-    <w:lsdException w:name="List Table 4 Accent 3" w:uiPriority="49"/>
-    <w:lsdException w:name="List Table 5 Dark Accent 3" w:uiPriority="50"/>
-    <w:lsdException w:name="List Table 6 Colorful Accent 3" w:uiPriority="51"/>
-    <w:lsdException w:name="List Table 7 Colorful Accent 3" w:uiPriority="52"/>
-    <w:lsdException w:name="List Table 1 Light Accent 4" w:uiPriority="46"/>
-    <w:lsdException w:name="List Table 2 Accent 4" w:uiPriority="47"/>
-    <w:lsdException w:name="List Table 3 Accent 4" w:uiPriority="48"/>
-    <w:lsdException w:name="List Table 4 Accent 4" w:uiPriority="49"/>
-    <w:lsdException w:name="List Table 5 Dark Accent 4" w:uiPriority="50"/>
-    <w:lsdException w:name="List Table 6 Colorful Accent 4" w:uiPriority="51"/>
-    <w:lsdException w:name="List Table 7 Colorful Accent 4" w:uiPriority="52"/>
-    <w:lsdException w:name="List Table 1 Light Accent 5" w:uiPriority="46"/>
-    <w:lsdException w:name="List Table 2 Accent 5" w:uiPriority="47"/>
-    <w:lsdException w:name="List Table 3 Accent 5" w:uiPriority="48"/>
-    <w:lsdException w:name="List Table 4 Accent 5" w:uiPriority="49"/>
-    <w:lsdException w:name="List Table 5 Dark Accent 5" w:uiPriority="50"/>
-    <w:lsdException w:name="List Table 6 Colorful Accent 5" w:uiPriority="51"/>
-    <w:lsdException w:name="List Table 7 Colorful Accent 5" w:uiPriority="52"/>
-    <w:lsdException w:name="List Table 1 Light Accent 6" w:uiPriority="46"/>
-    <w:lsdException w:name="List Table 2 Accent 6" w:uiPriority="47"/>
-    <w:lsdException w:name="List Table 3 Accent 6" w:uiPriority="48"/>
-    <w:lsdException w:name="List Table 4 Accent 6" w:uiPriority="49"/>
-    <w:lsdException w:name="List Table 5 Dark Accent 6" w:uiPriority="50"/>
-    <w:lsdException w:name="List Table 6 Colorful Accent 6" w:uiPriority="51"/>
-    <w:lsdException w:name="List Table 7 Colorful Accent 6" w:uiPriority="52"/>
-    <w:lsdException w:name="Mention" w:semiHidden="1" w:unhideWhenUsed="1"/>
-    <w:lsdException w:name="Smart Hyperlink" w:semiHidden="1" w:unhideWhenUsed="1"/>
-    <w:lsdException w:name="Hashtag" w:semiHidden="1" w:unhideWhenUsed="1"/>
-    <w:lsdException w:name="Unresolved Mention" w:semiHidden="1" w:unhideWhenUsed="1"/>
-    <w:lsdException w:name="Smart Link" w:semiHidden="1" w:unhideWhenUsed="1"/>
+  <w:latentStyles w:defLockedState="0" w:defUIPriority="99" w:defSemiHidden="1" w:defUnhideWhenUsed="1" w:defQFormat="0" w:count="267">
+    <w:lsdException w:name="Normal" w:semiHidden="0" w:uiPriority="0" w:unhideWhenUsed="0" w:qFormat="1"/>
+    <w:lsdException w:name="heading 1" w:semiHidden="0" w:uiPriority="9" w:unhideWhenUsed="0" w:qFormat="1"/>
+    <w:lsdException w:name="heading 2" w:uiPriority="9" w:qFormat="1"/>
+    <w:lsdException w:name="heading 3" w:uiPriority="9" w:qFormat="1"/>
+    <w:lsdException w:name="heading 4" w:uiPriority="9" w:qFormat="1"/>
+    <w:lsdException w:name="heading 5" w:uiPriority="9" w:qFormat="1"/>
+    <w:lsdException w:name="heading 6" w:uiPriority="9" w:qFormat="1"/>
+    <w:lsdException w:name="heading 7" w:uiPriority="9" w:qFormat="1"/>
+    <w:lsdException w:name="heading 8" w:uiPriority="9" w:qFormat="1"/>
+    <w:lsdException w:name="heading 9" w:uiPriority="9" w:qFormat="1"/>
+    <w:lsdException w:name="toc 1" w:uiPriority="39"/>
+    <w:lsdException w:name="toc 2" w:uiPriority="39"/>
+    <w:lsdException w:name="toc 3" w:uiPriority="39"/>
+    <w:lsdException w:name="toc 4" w:uiPriority="39"/>
+    <w:lsdException w:name="toc 5" w:uiPriority="39"/>
+    <w:lsdException w:name="toc 6" w:uiPriority="39"/>
+    <w:lsdException w:name="toc 7" w:uiPriority="39"/>
+    <w:lsdException w:name="toc 8" w:uiPriority="39"/>
+    <w:lsdException w:name="toc 9" w:uiPriority="39"/>
+    <w:lsdException w:name="caption" w:uiPriority="35" w:qFormat="1"/>
+    <w:lsdException w:name="Title" w:semiHidden="0" w:uiPriority="10" w:unhideWhenUsed="0" w:qFormat="1"/>
+    <w:lsdException w:name="Default Paragraph Font" w:uiPriority="1"/>
+    <w:lsdException w:name="Subtitle" w:semiHidden="0" w:uiPriority="11" w:unhideWhenUsed="0" w:qFormat="1"/>
+    <w:lsdException w:name="Strong" w:semiHidden="0" w:uiPriority="22" w:unhideWhenUsed="0" w:qFormat="1"/>
+    <w:lsdException w:name="Emphasis" w:semiHidden="0" w:uiPriority="20" w:unhideWhenUsed="0" w:qFormat="1"/>
+    <w:lsdException w:name="Table Grid" w:semiHidden="0" w:uiPriority="39" w:unhideWhenUsed="0"/>
+    <w:lsdException w:name="Placeholder Text" w:unhideWhenUsed="0"/>
+    <w:lsdException w:name="No Spacing" w:semiHidden="0" w:uiPriority="1" w:unhideWhenUsed="0" w:qFormat="1"/>
+    <w:lsdException w:name="Light Shading" w:semiHidden="0" w:uiPriority="60" w:unhideWhenUsed="0"/>
+    <w:lsdException w:name="Light List" w:semiHidden="0" w:uiPriority="61" w:unhideWhenUsed="0"/>
+    <w:lsdException w:name="Light Grid" w:semiHidden="0" w:uiPriority="62" w:unhideWhenUsed="0"/>
+    <w:lsdException w:name="Medium Shading 1" w:semiHidden="0" w:uiPriority="63" w:unhideWhenUsed="0"/>
+    <w:lsdException w:name="Medium Shading 2" w:semiHidden="0" w:uiPriority="64" w:unhideWhenUsed="0"/>
+    <w:lsdException w:name="Medium List 1" w:semiHidden="0" w:uiPriority="65" w:unhideWhenUsed="0"/>
+    <w:lsdException w:name="Medium List 2" w:semiHidden="0" w:uiPriority="66" w:unhideWhenUsed="0"/>
+    <w:lsdException w:name="Medium Grid 1" w:semiHidden="0" w:uiPriority="67" w:unhideWhenUsed="0"/>
+    <w:lsdException w:name="Medium Grid 2" w:semiHidden="0" w:uiPriority="68" w:unhideWhenUsed="0"/>
+    <w:lsdException w:name="Medium Grid 3" w:semiHidden="0" w:uiPriority="69" w:unhideWhenUsed="0"/>
+    <w:lsdException w:name="Dark List" w:semiHidden="0" w:uiPriority="70" w:unhideWhenUsed="0"/>
+    <w:lsdException w:name="Colorful Shading" w:semiHidden="0" w:uiPriority="71" w:unhideWhenUsed="0"/>
+    <w:lsdException w:name="Colorful List" w:semiHidden="0" w:uiPriority="72" w:unhideWhenUsed="0"/>
+    <w:lsdException w:name="Colorful Grid" w:semiHidden="0" w:uiPriority="73" w:unhideWhenUsed="0"/>
+    <w:lsdException w:name="Light Shading Accent 1" w:semiHidden="0" w:uiPriority="60" w:unhideWhenUsed="0"/>
+    <w:lsdException w:name="Light List Accent 1" w:semiHidden="0" w:uiPriority="61" w:unhideWhenUsed="0"/>
+    <w:lsdException w:name="Light Grid Accent 1" w:semiHidden="0" w:uiPriority="62" w:unhideWhenUsed="0"/>
+    <w:lsdException w:name="Medium Shading 1 Accent 1" w:semiHidden="0" w:uiPriority="63" w:unhideWhenUsed="0"/>
+    <w:lsdException w:name="Medium Shading 2 Accent 1" w:semiHidden="0" w:uiPriority="64" w:unhideWhenUsed="0"/>
+    <w:lsdException w:name="Medium List 1 Accent 1" w:semiHidden="0" w:uiPriority="65" w:unhideWhenUsed="0"/>
+    <w:lsdException w:name="Revision" w:unhideWhenUsed="0"/>
+    <w:lsdException w:name="List Paragraph" w:semiHidden="0" w:uiPriority="1" w:unhideWhenUsed="0" w:qFormat="1"/>
+    <w:lsdException w:name="Quote" w:semiHidden="0" w:uiPriority="29" w:unhideWhenUsed="0" w:qFormat="1"/>
+    <w:lsdException w:name="Intense Quote" w:semiHidden="0" w:uiPriority="30" w:unhideWhenUsed="0" w:qFormat="1"/>
+    <w:lsdException w:name="Medium List 2 Accent 1" w:semiHidden="0" w:uiPriority="66" w:unhideWhenUsed="0"/>
+    <w:lsdException w:name="Medium Grid 1 Accent 1" w:semiHidden="0" w:uiPriority="67" w:unhideWhenUsed="0"/>
+    <w:lsdException w:name="Medium Grid 2 Accent 1" w:semiHidden="0" w:uiPriority="68" w:unhideWhenUsed="0"/>
+    <w:lsdException w:name="Medium Grid 3 Accent 1" w:semiHidden="0" w:uiPriority="69" w:unhideWhenUsed="0"/>
+    <w:lsdException w:name="Dark List Accent 1" w:semiHidden="0" w:uiPriority="70" w:unhideWhenUsed="0"/>
+    <w:lsdException w:name="Colorful Shading Accent 1" w:semiHidden="0" w:uiPriority="71" w:unhideWhenUsed="0"/>
+    <w:lsdException w:name="Colorful List Accent 1" w:semiHidden="0" w:uiPriority="72" w:unhideWhenUsed="0"/>
+    <w:lsdException w:name="Colorful Grid Accent 1" w:semiHidden="0" w:uiPriority="73" w:unhideWhenUsed="0"/>
+    <w:lsdException w:name="Light Shading Accent 2" w:semiHidden="0" w:uiPriority="60" w:unhideWhenUsed="0"/>
+    <w:lsdException w:name="Light List Accent 2" w:semiHidden="0" w:uiPriority="61" w:unhideWhenUsed="0"/>
+    <w:lsdException w:name="Light Grid Accent 2" w:semiHidden="0" w:uiPriority="62" w:unhideWhenUsed="0"/>
+    <w:lsdException w:name="Medium Shading 1 Accent 2" w:semiHidden="0" w:uiPriority="63" w:unhideWhenUsed="0"/>
+    <w:lsdException w:name="Medium Shading 2 Accent 2" w:semiHidden="0" w:uiPriority="64" w:unhideWhenUsed="0"/>
+    <w:lsdException w:name="Medium List 1 Accent 2" w:semiHidden="0" w:uiPriority="65" w:unhideWhenUsed="0"/>
+    <w:lsdException w:name="Medium List 2 Accent 2" w:semiHidden="0" w:uiPriority="66" w:unhideWhenUsed="0"/>
+    <w:lsdException w:name="Medium Grid 1 Accent 2" w:semiHidden="0" w:uiPriority="67" w:unhideWhenUsed="0"/>
+    <w:lsdException w:name="Medium Grid 2 Accent 2" w:semiHidden="0" w:uiPriority="68" w:unhideWhenUsed="0"/>
+    <w:lsdException w:name="Medium Grid 3 Accent 2" w:semiHidden="0" w:uiPriority="69" w:unhideWhenUsed="0"/>
+    <w:lsdException w:name="Dark List Accent 2" w:semiHidden="0" w:uiPriority="70" w:unhideWhenUsed="0"/>
+    <w:lsdException w:name="Colorful Shading Accent 2" w:semiHidden="0" w:uiPriority="71" w:unhideWhenUsed="0"/>
+    <w:lsdException w:name="Colorful List Accent 2" w:semiHidden="0" w:uiPriority="72" w:unhideWhenUsed="0"/>
+    <w:lsdException w:name="Colorful Grid Accent 2" w:semiHidden="0" w:uiPriority="73" w:unhideWhenUsed="0"/>
+    <w:lsdException w:name="Light Shading Accent 3" w:semiHidden="0" w:uiPriority="60" w:unhideWhenUsed="0"/>
+    <w:lsdException w:name="Light List Accent 3" w:semiHidden="0" w:uiPriority="61" w:unhideWhenUsed="0"/>
+    <w:lsdException w:name="Light Grid Accent 3" w:semiHidden="0" w:uiPriority="62" w:unhideWhenUsed="0"/>
+    <w:lsdException w:name="Medium Shading 1 Accent 3" w:semiHidden="0" w:uiPriority="63" w:unhideWhenUsed="0"/>
+    <w:lsdException w:name="Medium Shading 2 Accent 3" w:semiHidden="0" w:uiPriority="64" w:unhideWhenUsed="0"/>
+    <w:lsdException w:name="Medium List 1 Accent 3" w:semiHidden="0" w:uiPriority="65" w:unhideWhenUsed="0"/>
+    <w:lsdException w:name="Medium List 2 Accent 3" w:semiHidden="0" w:uiPriority="66" w:unhideWhenUsed="0"/>
+    <w:lsdException w:name="Medium Grid 1 Accent 3" w:semiHidden="0" w:uiPriority="67" w:unhideWhenUsed="0"/>
+    <w:lsdException w:name="Medium Grid 2 Accent 3" w:semiHidden="0" w:uiPriority="68" w:unhideWhenUsed="0"/>
+    <w:lsdException w:name="Medium Grid 3 Accent 3" w:semiHidden="0" w:uiPriority="69" w:unhideWhenUsed="0"/>
+    <w:lsdException w:name="Dark List Accent 3" w:semiHidden="0" w:uiPriority="70" w:unhideWhenUsed="0"/>
+    <w:lsdException w:name="Colorful Shading Accent 3" w:semiHidden="0" w:uiPriority="71" w:unhideWhenUsed="0"/>
+    <w:lsdException w:name="Colorful List Accent 3" w:semiHidden="0" w:uiPriority="72" w:unhideWhenUsed="0"/>
+    <w:lsdException w:name="Colorful Grid Accent 3" w:semiHidden="0" w:uiPriority="73" w:unhideWhenUsed="0"/>
+    <w:lsdException w:name="Light Shading Accent 4" w:semiHidden="0" w:uiPriority="60" w:unhideWhenUsed="0"/>
+    <w:lsdException w:name="Light List Accent 4" w:semiHidden="0" w:uiPriority="61" w:unhideWhenUsed="0"/>
+    <w:lsdException w:name="Light Grid Accent 4" w:semiHidden="0" w:uiPriority="62" w:unhideWhenUsed="0"/>
+    <w:lsdException w:name="Medium Shading 1 Accent 4" w:semiHidden="0" w:uiPriority="63" w:unhideWhenUsed="0"/>
+    <w:lsdException w:name="Medium Shading 2 Accent 4" w:semiHidden="0" w:uiPriority="64" w:unhideWhenUsed="0"/>
+    <w:lsdException w:name="Medium List 1 Accent 4" w:semiHidden="0" w:uiPriority="65" w:unhideWhenUsed="0"/>
+    <w:lsdException w:name="Medium List 2 Accent 4" w:semiHidden="0" w:uiPriority="66" w:unhideWhenUsed="0"/>
+    <w:lsdException w:name="Medium Grid 1 Accent 4" w:semiHidden="0" w:uiPriority="67" w:unhideWhenUsed="0"/>
+    <w:lsdException w:name="Medium Grid 2 Accent 4" w:semiHidden="0" w:uiPriority="68" w:unhideWhenUsed="0"/>
+    <w:lsdException w:name="Medium Grid 3 Accent 4" w:semiHidden="0" w:uiPriority="69" w:unhideWhenUsed="0"/>
+    <w:lsdException w:name="Dark List Accent 4" w:semiHidden="0" w:uiPriority="70" w:unhideWhenUsed="0"/>
+    <w:lsdException w:name="Colorful Shading Accent 4" w:semiHidden="0" w:uiPriority="71" w:unhideWhenUsed="0"/>
+    <w:lsdException w:name="Colorful List Accent 4" w:semiHidden="0" w:uiPriority="72" w:unhideWhenUsed="0"/>
+    <w:lsdException w:name="Colorful Grid Accent 4" w:semiHidden="0" w:uiPriority="73" w:unhideWhenUsed="0"/>
+    <w:lsdException w:name="Light Shading Accent 5" w:semiHidden="0" w:uiPriority="60" w:unhideWhenUsed="0"/>
+    <w:lsdException w:name="Light List Accent 5" w:semiHidden="0" w:uiPriority="61" w:unhideWhenUsed="0"/>
+    <w:lsdException w:name="Light Grid Accent 5" w:semiHidden="0" w:uiPriority="62" w:unhideWhenUsed="0"/>
+    <w:lsdException w:name="Medium Shading 1 Accent 5" w:semiHidden="0" w:uiPriority="63" w:unhideWhenUsed="0"/>
+    <w:lsdException w:name="Medium Shading 2 Accent 5" w:semiHidden="0" w:uiPriority="64" w:unhideWhenUsed="0"/>
+    <w:lsdException w:name="Medium List 1 Accent 5" w:semiHidden="0" w:uiPriority="65" w:unhideWhenUsed="0"/>
+    <w:lsdException w:name="Medium List 2 Accent 5" w:semiHidden="0" w:uiPriority="66" w:unhideWhenUsed="0"/>
+    <w:lsdException w:name="Medium Grid 1 Accent 5" w:semiHidden="0" w:uiPriority="67" w:unhideWhenUsed="0"/>
+    <w:lsdException w:name="Medium Grid 2 Accent 5" w:semiHidden="0" w:uiPriority="68" w:unhideWhenUsed="0"/>
+    <w:lsdException w:name="Medium Grid 3 Accent 5" w:semiHidden="0" w:uiPriority="69" w:unhideWhenUsed="0"/>
+    <w:lsdException w:name="Dark List Accent 5" w:semiHidden="0" w:uiPriority="70" w:unhideWhenUsed="0"/>
+    <w:lsdException w:name="Colorful Shading Accent 5" w:semiHidden="0" w:uiPriority="71" w:unhideWhenUsed="0"/>
+    <w:lsdException w:name="Colorful List Accent 5" w:semiHidden="0" w:uiPriority="72" w:unhideWhenUsed="0"/>
+    <w:lsdException w:name="Colorful Grid Accent 5" w:semiHidden="0" w:uiPriority="73" w:unhideWhenUsed="0"/>
+    <w:lsdException w:name="Light Shading Accent 6" w:semiHidden="0" w:uiPriority="60" w:unhideWhenUsed="0"/>
+    <w:lsdException w:name="Light List Accent 6" w:semiHidden="0" w:uiPriority="61" w:unhideWhenUsed="0"/>
+    <w:lsdException w:name="Light Grid Accent 6" w:semiHidden="0" w:uiPriority="62" w:unhideWhenUsed="0"/>
+    <w:lsdException w:name="Medium Shading 1 Accent 6" w:semiHidden="0" w:uiPriority="63" w:unhideWhenUsed="0"/>
+    <w:lsdException w:name="Medium Shading 2 Accent 6" w:semiHidden="0" w:uiPriority="64" w:unhideWhenUsed="0"/>
+    <w:lsdException w:name="Medium List 1 Accent 6" w:semiHidden="0" w:uiPriority="65" w:unhideWhenUsed="0"/>
+    <w:lsdException w:name="Medium List 2 Accent 6" w:semiHidden="0" w:uiPriority="66" w:unhideWhenUsed="0"/>
+    <w:lsdException w:name="Medium Grid 1 Accent 6" w:semiHidden="0" w:uiPriority="67" w:unhideWhenUsed="0"/>
+    <w:lsdException w:name="Medium Grid 2 Accent 6" w:semiHidden="0" w:uiPriority="68" w:unhideWhenUsed="0"/>
+    <w:lsdException w:name="Medium Grid 3 Accent 6" w:semiHidden="0" w:uiPriority="69" w:unhideWhenUsed="0"/>
+    <w:lsdException w:name="Dark List Accent 6" w:semiHidden="0" w:uiPriority="70" w:unhideWhenUsed="0"/>
+    <w:lsdException w:name="Colorful Shading Accent 6" w:semiHidden="0" w:uiPriority="71" w:unhideWhenUsed="0"/>
+    <w:lsdException w:name="Colorful List Accent 6" w:semiHidden="0" w:uiPriority="72" w:unhideWhenUsed="0"/>
+    <w:lsdException w:name="Colorful Grid Accent 6" w:semiHidden="0" w:uiPriority="73" w:unhideWhenUsed="0"/>
+    <w:lsdException w:name="Subtle Emphasis" w:semiHidden="0" w:uiPriority="19" w:unhideWhenUsed="0" w:qFormat="1"/>
+    <w:lsdException w:name="Intense Emphasis" w:semiHidden="0" w:uiPriority="21" w:unhideWhenUsed="0" w:qFormat="1"/>
+    <w:lsdException w:name="Subtle Reference" w:semiHidden="0" w:uiPriority="31" w:unhideWhenUsed="0" w:qFormat="1"/>
+    <w:lsdException w:name="Intense Reference" w:semiHidden="0" w:uiPriority="32" w:unhideWhenUsed="0" w:qFormat="1"/>
+    <w:lsdException w:name="Book Title" w:semiHidden="0" w:uiPriority="33" w:unhideWhenUsed="0" w:qFormat="1"/>
+    <w:lsdException w:name="Bibliography" w:uiPriority="37"/>
+    <w:lsdException w:name="TOC Heading" w:uiPriority="39" w:qFormat="1"/>
+  </w:latentStyles>
+  <w:style w:type="paragraph" w:default="1" w:styleId="Normal">
+    <w:name w:val="Normal"/>
+    <w:qFormat/>
+    <w:rsid w:val="005B4621"/>
+    <w:pPr>
+      <w:spacing w:after="200" w:line="276" w:lineRule="auto"/>
+    </w:pPr>
+    <w:rPr>
+      <w:rFonts w:eastAsiaTheme="minorEastAsia"/>
+    </w:rPr>
+  </w:style>
+  <w:style w:type="character" w:default="1" w:styleId="DefaultParagraphFont">
+    <w:name w:val="Default Paragraph Font"/>
+    <w:uiPriority w:val="1"/>
+    <w:semiHidden/>
+    <w:unhideWhenUsed/>
+  </w:style>
+  <w:style w:type="table" w:default="1" w:styleId="TableNormal">
+    <w:name w:val="Normal Table"/>
+    <w:uiPriority w:val="99"/>
+    <w:semiHidden/>
+    <w:unhideWhenUsed/>
+    <w:tblPr>
+      <w:tblInd w:w="0" w:type="dxa"/>
+      <w:tblCellMar>
+        <w:top w:w="0" w:type="dxa"/>
+        <w:left w:w="108" w:type="dxa"/>
+        <w:bottom w:w="0" w:type="dxa"/>
+        <w:right w:w="108" w:type="dxa"/>
+      </w:tblCellMar>
+    </w:tblPr>
+  </w:style>
+  <w:style w:type="numbering" w:default="1" w:styleId="NoList">
+    <w:name w:val="No List"/>
+    <w:uiPriority w:val="99"/>
+    <w:semiHidden/>
+    <w:unhideWhenUsed/>
+  </w:style>
+  <w:style w:type="paragraph" w:styleId="ListParagraph">
+    <w:name w:val="List Paragraph"/>
+    <w:basedOn w:val="Normal"/>
+    <w:link w:val="ListParagraphChar"/>
+    <w:uiPriority w:val="1"/>
+    <w:qFormat/>
+    <w:rsid w:val="005B4621"/>
+    <w:pPr>
+      <w:ind w:left="720"/>
+      <w:contextualSpacing/>
+    </w:pPr>
+  </w:style>
+  <w:style w:type="character" w:customStyle="1" w:styleId="ListParagraphChar">
+    <w:name w:val="List Paragraph Char"/>
+    <w:basedOn w:val="DefaultParagraphFont"/>
+    <w:link w:val="ListParagraph"/>
+    <w:uiPriority w:val="1"/>
+    <w:locked/>
+    <w:rsid w:val="005B4621"/>
+    <w:rPr>
+      <w:rFonts w:eastAsiaTheme="minorEastAsia"/>
+    </w:rPr>
+  </w:style>
+  <w:style w:type="character" w:styleId="Hyperlink">
+    <w:name w:val="Hyperlink"/>
+    <w:basedOn w:val="DefaultParagraphFont"/>
+    <w:uiPriority w:val="99"/>
+    <w:semiHidden/>
+    <w:unhideWhenUsed/>
+    <w:rsid w:val="005B4621"/>
+    <w:rPr>
+      <w:color w:val="0000FF"/>
+      <w:u w:val="single"/>
+    </w:rPr>
+  </w:style>
+</w:styles>
+</file>
+
+<file path=word/stylesWithEffects.xml><?xml version="1.0" encoding="utf-8"?>
+<w:styles xmlns:wpc="http://schemas.microsoft.com/office/word/2010/wordprocessingCanvas" xmlns:mc="http://schemas.openxmlformats.org/markup-compatibility/2006" xmlns:o="urn:schemas-microsoft-com:office:office" xmlns:r="http://schemas.openxmlformats.org/officeDocument/2006/relationships" xmlns:m="http://schemas.openxmlformats.org/officeDocument/2006/math" xmlns:v="urn:schemas-microsoft-com:vml" xmlns:wp14="http://schemas.microsoft.com/office/word/2010/wordprocessingDrawing" xmlns:wp="http://schemas.openxmlformats.org/drawingml/2006/wordprocessingDrawing" xmlns:w10="urn:schemas-microsoft-com:office:word" xmlns:w="http://schemas.openxmlformats.org/wordprocessingml/2006/main" xmlns:w14="http://schemas.microsoft.com/office/word/2010/wordml" xmlns:wpg="http://schemas.microsoft.com/office/word/2010/wordprocessingGroup" xmlns:wpi="http://schemas.microsoft.com/office/word/2010/wordprocessingInk" xmlns:wne="http://schemas.microsoft.com/office/word/2006/wordml" xmlns:wps="http://schemas.microsoft.com/office/word/2010/wordprocessingShape" mc:Ignorable="w14 wp14">
+  <w:docDefaults>
+    <w:rPrDefault>
+      <w:rPr>
+        <w:rFonts w:asciiTheme="minorHAnsi" w:eastAsiaTheme="minorHAnsi" w:hAnsiTheme="minorHAnsi" w:cstheme="minorBidi"/>
+        <w:sz w:val="22"/>
+        <w:szCs w:val="22"/>
+        <w:lang w:val="en-US" w:eastAsia="en-US" w:bidi="ar-SA"/>
+      </w:rPr>
+    </w:rPrDefault>
+    <w:pPrDefault>
+      <w:pPr>
+        <w:spacing w:after="160" w:line="259" w:lineRule="auto"/>
+      </w:pPr>
+    </w:pPrDefault>
+  </w:docDefaults>
+  <w:latentStyles w:defLockedState="0" w:defUIPriority="99" w:defSemiHidden="1" w:defUnhideWhenUsed="1" w:defQFormat="0" w:count="267">
+    <w:lsdException w:name="Normal" w:semiHidden="0" w:uiPriority="0" w:unhideWhenUsed="0" w:qFormat="1"/>
+    <w:lsdException w:name="heading 1" w:semiHidden="0" w:uiPriority="9" w:unhideWhenUsed="0" w:qFormat="1"/>
+    <w:lsdException w:name="heading 2" w:uiPriority="9" w:qFormat="1"/>
+    <w:lsdException w:name="heading 3" w:uiPriority="9" w:qFormat="1"/>
+    <w:lsdException w:name="heading 4" w:uiPriority="9" w:qFormat="1"/>
+    <w:lsdException w:name="heading 5" w:uiPriority="9" w:qFormat="1"/>
+    <w:lsdException w:name="heading 6" w:uiPriority="9" w:qFormat="1"/>
+    <w:lsdException w:name="heading 7" w:uiPriority="9" w:qFormat="1"/>
+    <w:lsdException w:name="heading 8" w:uiPriority="9" w:qFormat="1"/>
+    <w:lsdException w:name="heading 9" w:uiPriority="9" w:qFormat="1"/>
+    <w:lsdException w:name="toc 1" w:uiPriority="39"/>
+    <w:lsdException w:name="toc 2" w:uiPriority="39"/>
+    <w:lsdException w:name="toc 3" w:uiPriority="39"/>
+    <w:lsdException w:name="toc 4" w:uiPriority="39"/>
+    <w:lsdException w:name="toc 5" w:uiPriority="39"/>
+    <w:lsdException w:name="toc 6" w:uiPriority="39"/>
+    <w:lsdException w:name="toc 7" w:uiPriority="39"/>
+    <w:lsdException w:name="toc 8" w:uiPriority="39"/>
+    <w:lsdException w:name="toc 9" w:uiPriority="39"/>
+    <w:lsdException w:name="caption" w:uiPriority="35" w:qFormat="1"/>
+    <w:lsdException w:name="Title" w:semiHidden="0" w:uiPriority="10" w:unhideWhenUsed="0" w:qFormat="1"/>
+    <w:lsdException w:name="Default Paragraph Font" w:uiPriority="1"/>
+    <w:lsdException w:name="Subtitle" w:semiHidden="0" w:uiPriority="11" w:unhideWhenUsed="0" w:qFormat="1"/>
+    <w:lsdException w:name="Strong" w:semiHidden="0" w:uiPriority="22" w:unhideWhenUsed="0" w:qFormat="1"/>
+    <w:lsdException w:name="Emphasis" w:semiHidden="0" w:uiPriority="20" w:unhideWhenUsed="0" w:qFormat="1"/>
+    <w:lsdException w:name="Table Grid" w:semiHidden="0" w:uiPriority="39" w:unhideWhenUsed="0"/>
+    <w:lsdException w:name="Placeholder Text" w:unhideWhenUsed="0"/>
+    <w:lsdException w:name="No Spacing" w:semiHidden="0" w:uiPriority="1" w:unhideWhenUsed="0" w:qFormat="1"/>
+    <w:lsdException w:name="Light Shading" w:semiHidden="0" w:uiPriority="60" w:unhideWhenUsed="0"/>
+    <w:lsdException w:name="Light List" w:semiHidden="0" w:uiPriority="61" w:unhideWhenUsed="0"/>
+    <w:lsdException w:name="Light Grid" w:semiHidden="0" w:uiPriority="62" w:unhideWhenUsed="0"/>
+    <w:lsdException w:name="Medium Shading 1" w:semiHidden="0" w:uiPriority="63" w:unhideWhenUsed="0"/>
+    <w:lsdException w:name="Medium Shading 2" w:semiHidden="0" w:uiPriority="64" w:unhideWhenUsed="0"/>
+    <w:lsdException w:name="Medium List 1" w:semiHidden="0" w:uiPriority="65" w:unhideWhenUsed="0"/>
+    <w:lsdException w:name="Medium List 2" w:semiHidden="0" w:uiPriority="66" w:unhideWhenUsed="0"/>
+    <w:lsdException w:name="Medium Grid 1" w:semiHidden="0" w:uiPriority="67" w:unhideWhenUsed="0"/>
+    <w:lsdException w:name="Medium Grid 2" w:semiHidden="0" w:uiPriority="68" w:unhideWhenUsed="0"/>
+    <w:lsdException w:name="Medium Grid 3" w:semiHidden="0" w:uiPriority="69" w:unhideWhenUsed="0"/>
+    <w:lsdException w:name="Dark List" w:semiHidden="0" w:uiPriority="70" w:unhideWhenUsed="0"/>
+    <w:lsdException w:name="Colorful Shading" w:semiHidden="0" w:uiPriority="71" w:unhideWhenUsed="0"/>
+    <w:lsdException w:name="Colorful List" w:semiHidden="0" w:uiPriority="72" w:unhideWhenUsed="0"/>
+    <w:lsdException w:name="Colorful Grid" w:semiHidden="0" w:uiPriority="73" w:unhideWhenUsed="0"/>
+    <w:lsdException w:name="Light Shading Accent 1" w:semiHidden="0" w:uiPriority="60" w:unhideWhenUsed="0"/>
+    <w:lsdException w:name="Light List Accent 1" w:semiHidden="0" w:uiPriority="61" w:unhideWhenUsed="0"/>
+    <w:lsdException w:name="Light Grid Accent 1" w:semiHidden="0" w:uiPriority="62" w:unhideWhenUsed="0"/>
+    <w:lsdException w:name="Medium Shading 1 Accent 1" w:semiHidden="0" w:uiPriority="63" w:unhideWhenUsed="0"/>
+    <w:lsdException w:name="Medium Shading 2 Accent 1" w:semiHidden="0" w:uiPriority="64" w:unhideWhenUsed="0"/>
+    <w:lsdException w:name="Medium List 1 Accent 1" w:semiHidden="0" w:uiPriority="65" w:unhideWhenUsed="0"/>
+    <w:lsdException w:name="Revision" w:unhideWhenUsed="0"/>
+    <w:lsdException w:name="List Paragraph" w:semiHidden="0" w:uiPriority="1" w:unhideWhenUsed="0" w:qFormat="1"/>
+    <w:lsdException w:name="Quote" w:semiHidden="0" w:uiPriority="29" w:unhideWhenUsed="0" w:qFormat="1"/>
+    <w:lsdException w:name="Intense Quote" w:semiHidden="0" w:uiPriority="30" w:unhideWhenUsed="0" w:qFormat="1"/>
+    <w:lsdException w:name="Medium List 2 Accent 1" w:semiHidden="0" w:uiPriority="66" w:unhideWhenUsed="0"/>
+    <w:lsdException w:name="Medium Grid 1 Accent 1" w:semiHidden="0" w:uiPriority="67" w:unhideWhenUsed="0"/>
+    <w:lsdException w:name="Medium Grid 2 Accent 1" w:semiHidden="0" w:uiPriority="68" w:unhideWhenUsed="0"/>
+    <w:lsdException w:name="Medium Grid 3 Accent 1" w:semiHidden="0" w:uiPriority="69" w:unhideWhenUsed="0"/>
+    <w:lsdException w:name="Dark List Accent 1" w:semiHidden="0" w:uiPriority="70" w:unhideWhenUsed="0"/>
+    <w:lsdException w:name="Colorful Shading Accent 1" w:semiHidden="0" w:uiPriority="71" w:unhideWhenUsed="0"/>
+    <w:lsdException w:name="Colorful List Accent 1" w:semiHidden="0" w:uiPriority="72" w:unhideWhenUsed="0"/>
+    <w:lsdException w:name="Colorful Grid Accent 1" w:semiHidden="0" w:uiPriority="73" w:unhideWhenUsed="0"/>
+    <w:lsdException w:name="Light Shading Accent 2" w:semiHidden="0" w:uiPriority="60" w:unhideWhenUsed="0"/>
+    <w:lsdException w:name="Light List Accent 2" w:semiHidden="0" w:uiPriority="61" w:unhideWhenUsed="0"/>
+    <w:lsdException w:name="Light Grid Accent 2" w:semiHidden="0" w:uiPriority="62" w:unhideWhenUsed="0"/>
+    <w:lsdException w:name="Medium Shading 1 Accent 2" w:semiHidden="0" w:uiPriority="63" w:unhideWhenUsed="0"/>
+    <w:lsdException w:name="Medium Shading 2 Accent 2" w:semiHidden="0" w:uiPriority="64" w:unhideWhenUsed="0"/>
+    <w:lsdException w:name="Medium List 1 Accent 2" w:semiHidden="0" w:uiPriority="65" w:unhideWhenUsed="0"/>
+    <w:lsdException w:name="Medium List 2 Accent 2" w:semiHidden="0" w:uiPriority="66" w:unhideWhenUsed="0"/>
+    <w:lsdException w:name="Medium Grid 1 Accent 2" w:semiHidden="0" w:uiPriority="67" w:unhideWhenUsed="0"/>
+    <w:lsdException w:name="Medium Grid 2 Accent 2" w:semiHidden="0" w:uiPriority="68" w:unhideWhenUsed="0"/>
+    <w:lsdException w:name="Medium Grid 3 Accent 2" w:semiHidden="0" w:uiPriority="69" w:unhideWhenUsed="0"/>
+    <w:lsdException w:name="Dark List Accent 2" w:semiHidden="0" w:uiPriority="70" w:unhideWhenUsed="0"/>
+    <w:lsdException w:name="Colorful Shading Accent 2" w:semiHidden="0" w:uiPriority="71" w:unhideWhenUsed="0"/>
+    <w:lsdException w:name="Colorful List Accent 2" w:semiHidden="0" w:uiPriority="72" w:unhideWhenUsed="0"/>
+    <w:lsdException w:name="Colorful Grid Accent 2" w:semiHidden="0" w:uiPriority="73" w:unhideWhenUsed="0"/>
+    <w:lsdException w:name="Light Shading Accent 3" w:semiHidden="0" w:uiPriority="60" w:unhideWhenUsed="0"/>
+    <w:lsdException w:name="Light List Accent 3" w:semiHidden="0" w:uiPriority="61" w:unhideWhenUsed="0"/>
+    <w:lsdException w:name="Light Grid Accent 3" w:semiHidden="0" w:uiPriority="62" w:unhideWhenUsed="0"/>
+    <w:lsdException w:name="Medium Shading 1 Accent 3" w:semiHidden="0" w:uiPriority="63" w:unhideWhenUsed="0"/>
+    <w:lsdException w:name="Medium Shading 2 Accent 3" w:semiHidden="0" w:uiPriority="64" w:unhideWhenUsed="0"/>
+    <w:lsdException w:name="Medium List 1 Accent 3" w:semiHidden="0" w:uiPriority="65" w:unhideWhenUsed="0"/>
+    <w:lsdException w:name="Medium List 2 Accent 3" w:semiHidden="0" w:uiPriority="66" w:unhideWhenUsed="0"/>
+    <w:lsdException w:name="Medium Grid 1 Accent 3" w:semiHidden="0" w:uiPriority="67" w:unhideWhenUsed="0"/>
+    <w:lsdException w:name="Medium Grid 2 Accent 3" w:semiHidden="0" w:uiPriority="68" w:unhideWhenUsed="0"/>
+    <w:lsdException w:name="Medium Grid 3 Accent 3" w:semiHidden="0" w:uiPriority="69" w:unhideWhenUsed="0"/>
+    <w:lsdException w:name="Dark List Accent 3" w:semiHidden="0" w:uiPriority="70" w:unhideWhenUsed="0"/>
+    <w:lsdException w:name="Colorful Shading Accent 3" w:semiHidden="0" w:uiPriority="71" w:unhideWhenUsed="0"/>
+    <w:lsdException w:name="Colorful List Accent 3" w:semiHidden="0" w:uiPriority="72" w:unhideWhenUsed="0"/>
+    <w:lsdException w:name="Colorful Grid Accent 3" w:semiHidden="0" w:uiPriority="73" w:unhideWhenUsed="0"/>
+    <w:lsdException w:name="Light Shading Accent 4" w:semiHidden="0" w:uiPriority="60" w:unhideWhenUsed="0"/>
+    <w:lsdException w:name="Light List Accent 4" w:semiHidden="0" w:uiPriority="61" w:unhideWhenUsed="0"/>
+    <w:lsdException w:name="Light Grid Accent 4" w:semiHidden="0" w:uiPriority="62" w:unhideWhenUsed="0"/>
+    <w:lsdException w:name="Medium Shading 1 Accent 4" w:semiHidden="0" w:uiPriority="63" w:unhideWhenUsed="0"/>
+    <w:lsdException w:name="Medium Shading 2 Accent 4" w:semiHidden="0" w:uiPriority="64" w:unhideWhenUsed="0"/>
+    <w:lsdException w:name="Medium List 1 Accent 4" w:semiHidden="0" w:uiPriority="65" w:unhideWhenUsed="0"/>
+    <w:lsdException w:name="Medium List 2 Accent 4" w:semiHidden="0" w:uiPriority="66" w:unhideWhenUsed="0"/>
+    <w:lsdException w:name="Medium Grid 1 Accent 4" w:semiHidden="0" w:uiPriority="67" w:unhideWhenUsed="0"/>
+    <w:lsdException w:name="Medium Grid 2 Accent 4" w:semiHidden="0" w:uiPriority="68" w:unhideWhenUsed="0"/>
+    <w:lsdException w:name="Medium Grid 3 Accent 4" w:semiHidden="0" w:uiPriority="69" w:unhideWhenUsed="0"/>
+    <w:lsdException w:name="Dark List Accent 4" w:semiHidden="0" w:uiPriority="70" w:unhideWhenUsed="0"/>
+    <w:lsdException w:name="Colorful Shading Accent 4" w:semiHidden="0" w:uiPriority="71" w:unhideWhenUsed="0"/>
+    <w:lsdException w:name="Colorful List Accent 4" w:semiHidden="0" w:uiPriority="72" w:unhideWhenUsed="0"/>
+    <w:lsdException w:name="Colorful Grid Accent 4" w:semiHidden="0" w:uiPriority="73" w:unhideWhenUsed="0"/>
+    <w:lsdException w:name="Light Shading Accent 5" w:semiHidden="0" w:uiPriority="60" w:unhideWhenUsed="0"/>
+    <w:lsdException w:name="Light List Accent 5" w:semiHidden="0" w:uiPriority="61" w:unhideWhenUsed="0"/>
+    <w:lsdException w:name="Light Grid Accent 5" w:semiHidden="0" w:uiPriority="62" w:unhideWhenUsed="0"/>
+    <w:lsdException w:name="Medium Shading 1 Accent 5" w:semiHidden="0" w:uiPriority="63" w:unhideWhenUsed="0"/>
+    <w:lsdException w:name="Medium Shading 2 Accent 5" w:semiHidden="0" w:uiPriority="64" w:unhideWhenUsed="0"/>
+    <w:lsdException w:name="Medium List 1 Accent 5" w:semiHidden="0" w:uiPriority="65" w:unhideWhenUsed="0"/>
+    <w:lsdException w:name="Medium List 2 Accent 5" w:semiHidden="0" w:uiPriority="66" w:unhideWhenUsed="0"/>
+    <w:lsdException w:name="Medium Grid 1 Accent 5" w:semiHidden="0" w:uiPriority="67" w:unhideWhenUsed="0"/>
+    <w:lsdException w:name="Medium Grid 2 Accent 5" w:semiHidden="0" w:uiPriority="68" w:unhideWhenUsed="0"/>
+    <w:lsdException w:name="Medium Grid 3 Accent 5" w:semiHidden="0" w:uiPriority="69" w:unhideWhenUsed="0"/>
+    <w:lsdException w:name="Dark List Accent 5" w:semiHidden="0" w:uiPriority="70" w:unhideWhenUsed="0"/>
+    <w:lsdException w:name="Colorful Shading Accent 5" w:semiHidden="0" w:uiPriority="71" w:unhideWhenUsed="0"/>
+    <w:lsdException w:name="Colorful List Accent 5" w:semiHidden="0" w:uiPriority="72" w:unhideWhenUsed="0"/>
+    <w:lsdException w:name="Colorful Grid Accent 5" w:semiHidden="0" w:uiPriority="73" w:unhideWhenUsed="0"/>
+    <w:lsdException w:name="Light Shading Accent 6" w:semiHidden="0" w:uiPriority="60" w:unhideWhenUsed="0"/>
+    <w:lsdException w:name="Light List Accent 6" w:semiHidden="0" w:uiPriority="61" w:unhideWhenUsed="0"/>
+    <w:lsdException w:name="Light Grid Accent 6" w:semiHidden="0" w:uiPriority="62" w:unhideWhenUsed="0"/>
+    <w:lsdException w:name="Medium Shading 1 Accent 6" w:semiHidden="0" w:uiPriority="63" w:unhideWhenUsed="0"/>
+    <w:lsdException w:name="Medium Shading 2 Accent 6" w:semiHidden="0" w:uiPriority="64" w:unhideWhenUsed="0"/>
+    <w:lsdException w:name="Medium List 1 Accent 6" w:semiHidden="0" w:uiPriority="65" w:unhideWhenUsed="0"/>
+    <w:lsdException w:name="Medium List 2 Accent 6" w:semiHidden="0" w:uiPriority="66" w:unhideWhenUsed="0"/>
+    <w:lsdException w:name="Medium Grid 1 Accent 6" w:semiHidden="0" w:uiPriority="67" w:unhideWhenUsed="0"/>
+    <w:lsdException w:name="Medium Grid 2 Accent 6" w:semiHidden="0" w:uiPriority="68" w:unhideWhenUsed="0"/>
+    <w:lsdException w:name="Medium Grid 3 Accent 6" w:semiHidden="0" w:uiPriority="69" w:unhideWhenUsed="0"/>
+    <w:lsdException w:name="Dark List Accent 6" w:semiHidden="0" w:uiPriority="70" w:unhideWhenUsed="0"/>
+    <w:lsdException w:name="Colorful Shading Accent 6" w:semiHidden="0" w:uiPriority="71" w:unhideWhenUsed="0"/>
+    <w:lsdException w:name="Colorful List Accent 6" w:semiHidden="0" w:uiPriority="72" w:unhideWhenUsed="0"/>
+    <w:lsdException w:name="Colorful Grid Accent 6" w:semiHidden="0" w:uiPriority="73" w:unhideWhenUsed="0"/>
+    <w:lsdException w:name="Subtle Emphasis" w:semiHidden="0" w:uiPriority="19" w:unhideWhenUsed="0" w:qFormat="1"/>
+    <w:lsdException w:name="Intense Emphasis" w:semiHidden="0" w:uiPriority="21" w:unhideWhenUsed="0" w:qFormat="1"/>
+    <w:lsdException w:name="Subtle Reference" w:semiHidden="0" w:uiPriority="31" w:unhideWhenUsed="0" w:qFormat="1"/>
+    <w:lsdException w:name="Intense Reference" w:semiHidden="0" w:uiPriority="32" w:unhideWhenUsed="0" w:qFormat="1"/>
+    <w:lsdException w:name="Book Title" w:semiHidden="0" w:uiPriority="33" w:unhideWhenUsed="0" w:qFormat="1"/>
+    <w:lsdException w:name="Bibliography" w:uiPriority="37"/>
+    <w:lsdException w:name="TOC Heading" w:uiPriority="39" w:qFormat="1"/>
   </w:latentStyles>
   <w:style w:type="paragraph" w:default="1" w:styleId="Normal">
     <w:name w:val="Normal"/>
@@ -2862,7 +2801,7 @@
   <a:extraClrSchemeLst/>
   <a:extLst>
     <a:ext uri="{05A4C25C-085E-4340-85A3-A5531E510DB2}">
-      <thm15:themeFamily xmlns:thm15="http://schemas.microsoft.com/office/thememl/2012/main" name="Office Theme" id="{62F939B6-93AF-4DB8-9C6B-D6C7DFDC589F}" vid="{4A3C46E8-61CC-4603-A589-7422A47A8E4A}"/>
+      <thm15:themeFamily xmlns:thm15="http://schemas.microsoft.com/office/thememl/2012/main" xmlns="" name="Office Theme" id="{62F939B6-93AF-4DB8-9C6B-D6C7DFDC589F}" vid="{4A3C46E8-61CC-4603-A589-7422A47A8E4A}"/>
     </a:ext>
   </a:extLst>
 </a:theme>

</xml_diff>

<commit_message>
Update employee contract template CTC wording formatting and spacing
</commit_message>
<xml_diff>
--- a/templates/employee-contract-template.docx
+++ b/templates/employee-contract-template.docx
@@ -351,7 +351,7 @@
           <w:b/>
           <w:bCs/>
         </w:rPr>
-        <w:t xml:space="preserve">INR </w:t>
+        <w:t xml:space="preserve"> </w:t>
       </w:r>
       <w:r>
         <w:rPr>
@@ -369,7 +369,7 @@
         <w:t>MONTHLY CTC IN WORDS</w:t>
       </w:r>
       <w:r>
-        <w:t xml:space="preserve"> only), subject to applicable deductions. The Company may, at its sole and absolute discretion, grant a performance-based bonus, which shall be contingent upon the performance of the Company and the Employee. Any bonus paid shall be discretionary, shall not form part of the Employee’s salary, and shall not constitute any precedent or create an entitlement in any subsequent year.</w:t>
+        <w:t xml:space="preserve"> ), subject to applicable deductions. The Company may, at its sole and absolute discretion, grant a performance-based bonus, which shall be contingent upon the performance of the Company and the Employee. Any bonus paid shall be discretionary, shall not form part of the Employee’s salary, and shall not constitute any precedent or create an entitlement in any subsequent year.</w:t>
       </w:r>
     </w:p>
     <w:tbl>

</xml_diff>